<commit_message>
actividad_1 quedo, falta hacerla pero ahora sin IA, entenidndo y con multiplexor
</commit_message>
<xml_diff>
--- a/embebidos/laboratorio/practica2/reporte/practica2_SE.docx
+++ b/embebidos/laboratorio/practica2/reporte/practica2_SE.docx
@@ -287,7 +287,7 @@
           <w:sz w:val="36"/>
           <w:szCs w:val="36"/>
         </w:rPr>
-        <w:t>Alma Leticia Palacios Guerreo</w:t>
+        <w:t>Evangelina Lara Camacho</w:t>
       </w:r>
     </w:p>
     <w:p>
@@ -383,7 +383,7 @@
           <w:sz w:val="36"/>
           <w:szCs w:val="36"/>
         </w:rPr>
-        <w:t>1</w:t>
+        <w:t>26</w:t>
       </w:r>
       <w:r>
         <w:rPr>
@@ -391,76 +391,782 @@
           <w:sz w:val="36"/>
           <w:szCs w:val="36"/>
         </w:rPr>
-        <w:t>9</w:t>
-      </w:r>
-      <w:r>
-        <w:rPr>
-          <w:rFonts w:ascii="Arial" w:eastAsia="Arial" w:hAnsi="Arial" w:cs="Arial"/>
+        <w:t xml:space="preserve"> de septiembre del 2025</w:t>
+      </w:r>
+    </w:p>
+    <w:p>
+      <w:pPr>
+        <w:jc w:val="center"/>
+        <w:rPr>
+          <w:rFonts w:ascii="Arial" w:hAnsi="Arial" w:cs="Arial"/>
           <w:sz w:val="36"/>
           <w:szCs w:val="36"/>
         </w:rPr>
-        <w:t xml:space="preserve"> de septiembre del 2025</w:t>
-      </w:r>
-    </w:p>
-    <w:p>
-      <w:pPr>
-        <w:jc w:val="center"/>
-        <w:rPr>
-          <w:rFonts w:ascii="Arial" w:hAnsi="Arial" w:cs="Arial"/>
-          <w:sz w:val="36"/>
-          <w:szCs w:val="36"/>
-        </w:rPr>
-      </w:pPr>
-    </w:p>
-    <w:p>
-      <w:pPr>
-        <w:rPr>
-          <w:rFonts w:ascii="Arial" w:hAnsi="Arial" w:cs="Arial"/>
-        </w:rPr>
-      </w:pPr>
-    </w:p>
-    <w:p>
-      <w:pPr>
-        <w:rPr>
-          <w:rFonts w:ascii="Arial" w:hAnsi="Arial" w:cs="Arial"/>
-        </w:rPr>
-      </w:pPr>
-    </w:p>
-    <w:p>
-      <w:pPr>
-        <w:rPr>
-          <w:rFonts w:ascii="Arial" w:hAnsi="Arial" w:cs="Arial"/>
-        </w:rPr>
-      </w:pPr>
-    </w:p>
-    <w:p>
-      <w:pPr>
-        <w:rPr>
-          <w:rFonts w:ascii="Arial" w:hAnsi="Arial" w:cs="Arial"/>
-        </w:rPr>
-      </w:pPr>
-    </w:p>
-    <w:p>
-      <w:pPr>
-        <w:rPr>
-          <w:rFonts w:ascii="Arial" w:hAnsi="Arial" w:cs="Arial"/>
-        </w:rPr>
-      </w:pPr>
-    </w:p>
-    <w:p>
-      <w:pPr>
-        <w:rPr>
-          <w:rFonts w:ascii="Arial" w:hAnsi="Arial" w:cs="Arial"/>
-          <w:b/>
-          <w:bCs/>
-        </w:rPr>
-      </w:pPr>
-      <w:r>
-        <w:rPr>
-          <w:rFonts w:ascii="Arial" w:hAnsi="Arial" w:cs="Arial"/>
-          <w:b/>
-          <w:bCs/>
-        </w:rPr>
+      </w:pPr>
+    </w:p>
+    <w:p>
+      <w:pPr>
+        <w:rPr>
+          <w:rFonts w:ascii="Arial" w:hAnsi="Arial" w:cs="Arial"/>
+        </w:rPr>
+      </w:pPr>
+    </w:p>
+    <w:p>
+      <w:pPr>
+        <w:rPr>
+          <w:rFonts w:ascii="Arial" w:hAnsi="Arial" w:cs="Arial"/>
+          <w:b/>
+          <w:bCs/>
+        </w:rPr>
+      </w:pPr>
+      <w:r>
+        <w:rPr>
+          <w:rFonts w:ascii="Arial" w:hAnsi="Arial" w:cs="Arial"/>
+        </w:rPr>
+        <w:lastRenderedPageBreak/>
+        <w:t xml:space="preserve">Función </w:t>
+      </w:r>
+      <w:proofErr w:type="spellStart"/>
+      <w:r>
+        <w:rPr>
+          <w:rFonts w:ascii="Arial" w:hAnsi="Arial" w:cs="Arial"/>
+          <w:b/>
+          <w:bCs/>
+        </w:rPr>
+        <w:t>xTaskCreatePinnedToCore</w:t>
+      </w:r>
+      <w:proofErr w:type="spellEnd"/>
+      <w:r>
+        <w:rPr>
+          <w:rFonts w:ascii="Arial" w:hAnsi="Arial" w:cs="Arial"/>
+          <w:b/>
+          <w:bCs/>
+        </w:rPr>
+        <w:t>()</w:t>
+      </w:r>
+    </w:p>
+    <w:p>
+      <w:pPr>
+        <w:rPr>
+          <w:rFonts w:ascii="Arial" w:hAnsi="Arial" w:cs="Arial"/>
+          <w:lang w:val="es-ES"/>
+        </w:rPr>
+      </w:pPr>
+      <w:r>
+        <w:rPr>
+          <w:rFonts w:ascii="Arial" w:hAnsi="Arial" w:cs="Arial"/>
+        </w:rPr>
+        <w:t xml:space="preserve">es una función de </w:t>
+      </w:r>
+      <w:proofErr w:type="spellStart"/>
+      <w:r>
+        <w:rPr>
+          <w:rFonts w:ascii="Arial" w:hAnsi="Arial" w:cs="Arial"/>
+        </w:rPr>
+        <w:t>FreeRTOS</w:t>
+      </w:r>
+      <w:proofErr w:type="spellEnd"/>
+      <w:r>
+        <w:rPr>
+          <w:rFonts w:ascii="Arial" w:hAnsi="Arial" w:cs="Arial"/>
+        </w:rPr>
+        <w:t xml:space="preserve"> para ESP32 que te permite crear tareas y asignarlas específicamente a un núcleo del procesador.</w:t>
+      </w:r>
+      <w:r>
+        <w:rPr>
+          <w:rFonts w:ascii="Arial" w:hAnsi="Arial" w:cs="Arial"/>
+        </w:rPr>
+        <w:t xml:space="preserve"> </w:t>
+      </w:r>
+      <w:r>
+        <w:rPr>
+          <w:rFonts w:ascii="Arial" w:hAnsi="Arial" w:cs="Arial"/>
+          <w:lang w:val="es-ES"/>
+        </w:rPr>
+        <w:t>Evita</w:t>
+      </w:r>
+      <w:r>
+        <w:rPr>
+          <w:rFonts w:ascii="Arial" w:hAnsi="Arial" w:cs="Arial"/>
+          <w:lang w:val="es-ES"/>
+        </w:rPr>
+        <w:t>ndo</w:t>
+      </w:r>
+      <w:r>
+        <w:rPr>
+          <w:rFonts w:ascii="Arial" w:hAnsi="Arial" w:cs="Arial"/>
+          <w:lang w:val="es-ES"/>
+        </w:rPr>
+        <w:t xml:space="preserve"> sobrecargar un solo núcleo</w:t>
+      </w:r>
+      <w:r>
+        <w:rPr>
+          <w:rFonts w:ascii="Arial" w:hAnsi="Arial" w:cs="Arial"/>
+          <w:lang w:val="es-ES"/>
+        </w:rPr>
+        <w:t xml:space="preserve">, </w:t>
+      </w:r>
+      <w:r>
+        <w:rPr>
+          <w:rFonts w:ascii="Arial" w:hAnsi="Arial" w:cs="Arial"/>
+          <w:b/>
+          <w:bCs/>
+          <w:lang w:val="es-ES"/>
+        </w:rPr>
+        <w:t>Mejora el rendimiento</w:t>
+      </w:r>
+      <w:r>
+        <w:rPr>
+          <w:rFonts w:ascii="Arial" w:hAnsi="Arial" w:cs="Arial"/>
+          <w:lang w:val="es-ES"/>
+        </w:rPr>
+        <w:t> al distribuir el trabajo</w:t>
+      </w:r>
+    </w:p>
+    <w:p>
+      <w:pPr>
+        <w:rPr>
+          <w:rFonts w:ascii="Arial" w:hAnsi="Arial" w:cs="Arial"/>
+          <w:lang w:val="es-ES"/>
+        </w:rPr>
+      </w:pPr>
+      <w:proofErr w:type="spellStart"/>
+      <w:r>
+        <w:rPr>
+          <w:rFonts w:ascii="Arial" w:hAnsi="Arial" w:cs="Arial"/>
+          <w:lang w:val="es-ES"/>
+        </w:rPr>
+        <w:t>xTaskCreatePinnedToCore</w:t>
+      </w:r>
+      <w:proofErr w:type="spellEnd"/>
+      <w:r>
+        <w:rPr>
+          <w:rFonts w:ascii="Arial" w:hAnsi="Arial" w:cs="Arial"/>
+          <w:lang w:val="es-ES"/>
+        </w:rPr>
+        <w:t>(</w:t>
+      </w:r>
+    </w:p>
+    <w:p>
+      <w:pPr>
+        <w:rPr>
+          <w:rFonts w:ascii="Arial" w:hAnsi="Arial" w:cs="Arial"/>
+          <w:lang w:val="es-ES"/>
+        </w:rPr>
+      </w:pPr>
+      <w:r>
+        <w:rPr>
+          <w:rFonts w:ascii="Arial" w:hAnsi="Arial" w:cs="Arial"/>
+          <w:lang w:val="es-ES"/>
+        </w:rPr>
+        <w:t xml:space="preserve">    </w:t>
+      </w:r>
+      <w:proofErr w:type="spellStart"/>
+      <w:r>
+        <w:rPr>
+          <w:rFonts w:ascii="Arial" w:hAnsi="Arial" w:cs="Arial"/>
+          <w:lang w:val="es-ES"/>
+        </w:rPr>
+        <w:t>funcion_tarea</w:t>
+      </w:r>
+      <w:proofErr w:type="spellEnd"/>
+      <w:r>
+        <w:rPr>
+          <w:rFonts w:ascii="Arial" w:hAnsi="Arial" w:cs="Arial"/>
+          <w:lang w:val="es-ES"/>
+        </w:rPr>
+        <w:t>,    // La función que contiene el código de la tarea</w:t>
+      </w:r>
+    </w:p>
+    <w:p>
+      <w:pPr>
+        <w:rPr>
+          <w:rFonts w:ascii="Arial" w:hAnsi="Arial" w:cs="Arial"/>
+          <w:lang w:val="es-ES"/>
+        </w:rPr>
+      </w:pPr>
+      <w:r>
+        <w:rPr>
+          <w:rFonts w:ascii="Arial" w:hAnsi="Arial" w:cs="Arial"/>
+          <w:lang w:val="es-ES"/>
+        </w:rPr>
+        <w:t xml:space="preserve">    "</w:t>
+      </w:r>
+      <w:proofErr w:type="spellStart"/>
+      <w:r>
+        <w:rPr>
+          <w:rFonts w:ascii="Arial" w:hAnsi="Arial" w:cs="Arial"/>
+          <w:lang w:val="es-ES"/>
+        </w:rPr>
+        <w:t>NombreTarea</w:t>
+      </w:r>
+      <w:proofErr w:type="spellEnd"/>
+      <w:r>
+        <w:rPr>
+          <w:rFonts w:ascii="Arial" w:hAnsi="Arial" w:cs="Arial"/>
+          <w:lang w:val="es-ES"/>
+        </w:rPr>
+        <w:t>",    // Nombre para identificar la tarea</w:t>
+      </w:r>
+    </w:p>
+    <w:p>
+      <w:pPr>
+        <w:rPr>
+          <w:rFonts w:ascii="Arial" w:hAnsi="Arial" w:cs="Arial"/>
+          <w:lang w:val="es-ES"/>
+        </w:rPr>
+      </w:pPr>
+      <w:r>
+        <w:rPr>
+          <w:rFonts w:ascii="Arial" w:hAnsi="Arial" w:cs="Arial"/>
+          <w:lang w:val="es-ES"/>
+        </w:rPr>
+        <w:t xml:space="preserve">    2048,             // Memoria para la tarea (en palabras)</w:t>
+      </w:r>
+    </w:p>
+    <w:p>
+      <w:pPr>
+        <w:rPr>
+          <w:rFonts w:ascii="Arial" w:hAnsi="Arial" w:cs="Arial"/>
+          <w:lang w:val="es-ES"/>
+        </w:rPr>
+      </w:pPr>
+      <w:r>
+        <w:rPr>
+          <w:rFonts w:ascii="Arial" w:hAnsi="Arial" w:cs="Arial"/>
+          <w:lang w:val="es-ES"/>
+        </w:rPr>
+        <w:t xml:space="preserve">    NULL,             // Parámetros que le pasas a la tarea</w:t>
+      </w:r>
+    </w:p>
+    <w:p>
+      <w:pPr>
+        <w:rPr>
+          <w:rFonts w:ascii="Arial" w:hAnsi="Arial" w:cs="Arial"/>
+          <w:lang w:val="es-ES"/>
+        </w:rPr>
+      </w:pPr>
+      <w:r>
+        <w:rPr>
+          <w:rFonts w:ascii="Arial" w:hAnsi="Arial" w:cs="Arial"/>
+          <w:lang w:val="es-ES"/>
+        </w:rPr>
+        <w:t xml:space="preserve">    1,                // Prioridad (1=baja, números mayores=alta)</w:t>
+      </w:r>
+    </w:p>
+    <w:p>
+      <w:pPr>
+        <w:rPr>
+          <w:rFonts w:ascii="Arial" w:hAnsi="Arial" w:cs="Arial"/>
+          <w:lang w:val="es-ES"/>
+        </w:rPr>
+      </w:pPr>
+      <w:r>
+        <w:rPr>
+          <w:rFonts w:ascii="Arial" w:hAnsi="Arial" w:cs="Arial"/>
+          <w:lang w:val="es-ES"/>
+        </w:rPr>
+        <w:t xml:space="preserve">    NULL,             // Variable para manejar la tarea después</w:t>
+      </w:r>
+    </w:p>
+    <w:p>
+      <w:pPr>
+        <w:rPr>
+          <w:rFonts w:ascii="Arial" w:hAnsi="Arial" w:cs="Arial"/>
+          <w:lang w:val="es-ES"/>
+        </w:rPr>
+      </w:pPr>
+      <w:r>
+        <w:rPr>
+          <w:rFonts w:ascii="Arial" w:hAnsi="Arial" w:cs="Arial"/>
+          <w:lang w:val="es-ES"/>
+        </w:rPr>
+        <w:t xml:space="preserve">    0                 // Núcleo: 0=Core 0, 1=Core 1</w:t>
+      </w:r>
+    </w:p>
+    <w:p>
+      <w:pPr>
+        <w:rPr>
+          <w:rFonts w:ascii="Arial" w:hAnsi="Arial" w:cs="Arial"/>
+          <w:lang w:val="es-ES"/>
+        </w:rPr>
+      </w:pPr>
+      <w:r>
+        <w:rPr>
+          <w:rFonts w:ascii="Arial" w:hAnsi="Arial" w:cs="Arial"/>
+          <w:lang w:val="es-ES"/>
+        </w:rPr>
+        <w:t>);</w:t>
+      </w:r>
+    </w:p>
+    <w:p>
+      <w:pPr>
+        <w:rPr>
+          <w:rFonts w:ascii="Arial" w:hAnsi="Arial" w:cs="Arial"/>
+          <w:lang w:val="es-ES"/>
+        </w:rPr>
+      </w:pPr>
+    </w:p>
+    <w:p>
+      <w:pPr>
+        <w:rPr>
+          <w:rFonts w:ascii="Arial" w:hAnsi="Arial" w:cs="Arial"/>
+          <w:b/>
+          <w:bCs/>
+        </w:rPr>
+      </w:pPr>
+      <w:r>
+        <w:rPr>
+          <w:rFonts w:ascii="Arial" w:hAnsi="Arial" w:cs="Arial"/>
+          <w:lang w:val="es-ES"/>
+        </w:rPr>
+        <w:t xml:space="preserve">Función </w:t>
+      </w:r>
+      <w:proofErr w:type="spellStart"/>
+      <w:r>
+        <w:rPr>
+          <w:rFonts w:ascii="Arial" w:hAnsi="Arial" w:cs="Arial"/>
+          <w:b/>
+          <w:bCs/>
+          <w:lang w:val="es-ES"/>
+        </w:rPr>
+        <w:t>x</w:t>
+      </w:r>
+      <w:r>
+        <w:rPr>
+          <w:rFonts w:ascii="Arial" w:hAnsi="Arial" w:cs="Arial"/>
+          <w:b/>
+          <w:bCs/>
+          <w:lang w:val="es-ES"/>
+        </w:rPr>
+        <w:t>EventGroupSync</w:t>
+      </w:r>
+      <w:proofErr w:type="spellEnd"/>
+      <w:r>
+        <w:rPr>
+          <w:rFonts w:ascii="Arial" w:hAnsi="Arial" w:cs="Arial"/>
+          <w:b/>
+          <w:bCs/>
+          <w:lang w:val="es-ES"/>
+        </w:rPr>
+        <w:t>()</w:t>
+      </w:r>
+    </w:p>
+    <w:p>
+      <w:pPr>
+        <w:rPr>
+          <w:rFonts w:ascii="Arial" w:hAnsi="Arial" w:cs="Arial"/>
+          <w:lang w:val="es-ES"/>
+        </w:rPr>
+      </w:pPr>
+      <w:proofErr w:type="spellStart"/>
+      <w:r>
+        <w:rPr>
+          <w:rFonts w:ascii="Arial" w:hAnsi="Arial" w:cs="Arial"/>
+          <w:lang w:val="es-ES"/>
+        </w:rPr>
+        <w:t>xEventGroupSync</w:t>
+      </w:r>
+      <w:proofErr w:type="spellEnd"/>
+      <w:r>
+        <w:rPr>
+          <w:rFonts w:ascii="Arial" w:hAnsi="Arial" w:cs="Arial"/>
+          <w:lang w:val="es-ES"/>
+        </w:rPr>
+        <w:t> es una función sincronización que hace dos cosas al mismo tiempo:</w:t>
+      </w:r>
+    </w:p>
+    <w:p>
+      <w:pPr>
+        <w:numPr>
+          <w:ilvl w:val="0"/>
+          <w:numId w:val="8"/>
+        </w:numPr>
+        <w:rPr>
+          <w:rFonts w:ascii="Arial" w:hAnsi="Arial" w:cs="Arial"/>
+          <w:lang w:val="es-ES"/>
+        </w:rPr>
+      </w:pPr>
+      <w:r>
+        <w:rPr>
+          <w:rFonts w:ascii="Arial" w:hAnsi="Arial" w:cs="Arial"/>
+          <w:lang w:val="es-ES"/>
+        </w:rPr>
+        <w:t>Pone bits (banderas) en un grupo de eventos</w:t>
+      </w:r>
+    </w:p>
+    <w:p>
+      <w:pPr>
+        <w:numPr>
+          <w:ilvl w:val="0"/>
+          <w:numId w:val="8"/>
+        </w:numPr>
+        <w:rPr>
+          <w:rFonts w:ascii="Arial" w:hAnsi="Arial" w:cs="Arial"/>
+          <w:lang w:val="es-ES"/>
+        </w:rPr>
+      </w:pPr>
+      <w:r>
+        <w:rPr>
+          <w:rFonts w:ascii="Arial" w:hAnsi="Arial" w:cs="Arial"/>
+          <w:lang w:val="es-ES"/>
+        </w:rPr>
+        <w:t>Espera a que otros bits específicos se activen</w:t>
+      </w:r>
+    </w:p>
+    <w:p>
+      <w:pPr>
+        <w:rPr>
+          <w:rFonts w:ascii="Arial" w:hAnsi="Arial" w:cs="Arial"/>
+          <w:b/>
+          <w:bCs/>
+          <w:lang w:val="es-ES"/>
+        </w:rPr>
+      </w:pPr>
+      <w:r>
+        <w:rPr>
+          <w:rFonts w:ascii="Arial" w:hAnsi="Arial" w:cs="Arial"/>
+          <w:b/>
+          <w:bCs/>
+          <w:lang w:val="es-ES"/>
+        </w:rPr>
+        <w:t>Ejemplo:</w:t>
+      </w:r>
+    </w:p>
+    <w:p>
+      <w:pPr>
+        <w:rPr>
+          <w:rFonts w:ascii="Arial" w:hAnsi="Arial" w:cs="Arial"/>
+          <w:lang w:val="en-US"/>
+        </w:rPr>
+      </w:pPr>
+      <w:proofErr w:type="spellStart"/>
+      <w:r>
+        <w:rPr>
+          <w:rFonts w:ascii="Arial" w:hAnsi="Arial" w:cs="Arial"/>
+          <w:lang w:val="en-US"/>
+        </w:rPr>
+        <w:t>EventBits_t</w:t>
+      </w:r>
+      <w:proofErr w:type="spellEnd"/>
+      <w:r>
+        <w:rPr>
+          <w:rFonts w:ascii="Arial" w:hAnsi="Arial" w:cs="Arial"/>
+          <w:lang w:val="en-US"/>
+        </w:rPr>
+        <w:t xml:space="preserve"> </w:t>
+      </w:r>
+      <w:proofErr w:type="spellStart"/>
+      <w:r>
+        <w:rPr>
+          <w:rFonts w:ascii="Arial" w:hAnsi="Arial" w:cs="Arial"/>
+          <w:lang w:val="en-US"/>
+        </w:rPr>
+        <w:t>xEventGroupSync</w:t>
+      </w:r>
+      <w:proofErr w:type="spellEnd"/>
+      <w:r>
+        <w:rPr>
+          <w:rFonts w:ascii="Arial" w:hAnsi="Arial" w:cs="Arial"/>
+          <w:lang w:val="en-US"/>
+        </w:rPr>
+        <w:t>(</w:t>
+      </w:r>
+    </w:p>
+    <w:p>
+      <w:pPr>
+        <w:rPr>
+          <w:rFonts w:ascii="Arial" w:hAnsi="Arial" w:cs="Arial"/>
+          <w:lang w:val="en-US"/>
+        </w:rPr>
+      </w:pPr>
+      <w:r>
+        <w:rPr>
+          <w:rFonts w:ascii="Arial" w:hAnsi="Arial" w:cs="Arial"/>
+          <w:lang w:val="en-US"/>
+        </w:rPr>
+        <w:t xml:space="preserve">    </w:t>
+      </w:r>
+      <w:proofErr w:type="spellStart"/>
+      <w:r>
+        <w:rPr>
+          <w:rFonts w:ascii="Arial" w:hAnsi="Arial" w:cs="Arial"/>
+          <w:lang w:val="en-US"/>
+        </w:rPr>
+        <w:t>EventGroupHandle_t</w:t>
+      </w:r>
+      <w:proofErr w:type="spellEnd"/>
+      <w:r>
+        <w:rPr>
+          <w:rFonts w:ascii="Arial" w:hAnsi="Arial" w:cs="Arial"/>
+          <w:lang w:val="en-US"/>
+        </w:rPr>
+        <w:t xml:space="preserve"> </w:t>
+      </w:r>
+      <w:proofErr w:type="spellStart"/>
+      <w:r>
+        <w:rPr>
+          <w:rFonts w:ascii="Arial" w:hAnsi="Arial" w:cs="Arial"/>
+          <w:lang w:val="en-US"/>
+        </w:rPr>
+        <w:t>xEventGroup</w:t>
+      </w:r>
+      <w:proofErr w:type="spellEnd"/>
+      <w:r>
+        <w:rPr>
+          <w:rFonts w:ascii="Arial" w:hAnsi="Arial" w:cs="Arial"/>
+          <w:lang w:val="en-US"/>
+        </w:rPr>
+        <w:t xml:space="preserve">,  // Grupo de </w:t>
+      </w:r>
+      <w:proofErr w:type="spellStart"/>
+      <w:r>
+        <w:rPr>
+          <w:rFonts w:ascii="Arial" w:hAnsi="Arial" w:cs="Arial"/>
+          <w:lang w:val="en-US"/>
+        </w:rPr>
+        <w:t>eventos</w:t>
+      </w:r>
+      <w:proofErr w:type="spellEnd"/>
+      <w:r>
+        <w:rPr>
+          <w:rFonts w:ascii="Arial" w:hAnsi="Arial" w:cs="Arial"/>
+          <w:lang w:val="en-US"/>
+        </w:rPr>
+        <w:t xml:space="preserve"> a usar</w:t>
+      </w:r>
+    </w:p>
+    <w:p>
+      <w:pPr>
+        <w:rPr>
+          <w:rFonts w:ascii="Arial" w:hAnsi="Arial" w:cs="Arial"/>
+          <w:lang w:val="es-ES"/>
+        </w:rPr>
+      </w:pPr>
+      <w:r>
+        <w:rPr>
+          <w:rFonts w:ascii="Arial" w:hAnsi="Arial" w:cs="Arial"/>
+          <w:lang w:val="en-US"/>
+        </w:rPr>
+        <w:t xml:space="preserve">    </w:t>
+      </w:r>
+      <w:proofErr w:type="spellStart"/>
+      <w:r>
+        <w:rPr>
+          <w:rFonts w:ascii="Arial" w:hAnsi="Arial" w:cs="Arial"/>
+          <w:lang w:val="es-ES"/>
+        </w:rPr>
+        <w:t>const</w:t>
+      </w:r>
+      <w:proofErr w:type="spellEnd"/>
+      <w:r>
+        <w:rPr>
+          <w:rFonts w:ascii="Arial" w:hAnsi="Arial" w:cs="Arial"/>
+          <w:lang w:val="es-ES"/>
+        </w:rPr>
+        <w:t xml:space="preserve"> </w:t>
+      </w:r>
+      <w:proofErr w:type="spellStart"/>
+      <w:r>
+        <w:rPr>
+          <w:rFonts w:ascii="Arial" w:hAnsi="Arial" w:cs="Arial"/>
+          <w:lang w:val="es-ES"/>
+        </w:rPr>
+        <w:t>EventBits_t</w:t>
+      </w:r>
+      <w:proofErr w:type="spellEnd"/>
+      <w:r>
+        <w:rPr>
+          <w:rFonts w:ascii="Arial" w:hAnsi="Arial" w:cs="Arial"/>
+          <w:lang w:val="es-ES"/>
+        </w:rPr>
+        <w:t xml:space="preserve"> </w:t>
+      </w:r>
+      <w:proofErr w:type="spellStart"/>
+      <w:r>
+        <w:rPr>
+          <w:rFonts w:ascii="Arial" w:hAnsi="Arial" w:cs="Arial"/>
+          <w:lang w:val="es-ES"/>
+        </w:rPr>
+        <w:t>uxBitsToSet</w:t>
+      </w:r>
+      <w:proofErr w:type="spellEnd"/>
+      <w:r>
+        <w:rPr>
+          <w:rFonts w:ascii="Arial" w:hAnsi="Arial" w:cs="Arial"/>
+          <w:lang w:val="es-ES"/>
+        </w:rPr>
+        <w:t>,   // Bits que VOY a activar</w:t>
+      </w:r>
+    </w:p>
+    <w:p>
+      <w:pPr>
+        <w:rPr>
+          <w:rFonts w:ascii="Arial" w:hAnsi="Arial" w:cs="Arial"/>
+          <w:lang w:val="es-ES"/>
+        </w:rPr>
+      </w:pPr>
+      <w:r>
+        <w:rPr>
+          <w:rFonts w:ascii="Arial" w:hAnsi="Arial" w:cs="Arial"/>
+          <w:lang w:val="es-ES"/>
+        </w:rPr>
+        <w:t xml:space="preserve">    </w:t>
+      </w:r>
+      <w:proofErr w:type="spellStart"/>
+      <w:r>
+        <w:rPr>
+          <w:rFonts w:ascii="Arial" w:hAnsi="Arial" w:cs="Arial"/>
+          <w:lang w:val="es-ES"/>
+        </w:rPr>
+        <w:t>const</w:t>
+      </w:r>
+      <w:proofErr w:type="spellEnd"/>
+      <w:r>
+        <w:rPr>
+          <w:rFonts w:ascii="Arial" w:hAnsi="Arial" w:cs="Arial"/>
+          <w:lang w:val="es-ES"/>
+        </w:rPr>
+        <w:t xml:space="preserve"> </w:t>
+      </w:r>
+      <w:proofErr w:type="spellStart"/>
+      <w:r>
+        <w:rPr>
+          <w:rFonts w:ascii="Arial" w:hAnsi="Arial" w:cs="Arial"/>
+          <w:lang w:val="es-ES"/>
+        </w:rPr>
+        <w:t>EventBits_t</w:t>
+      </w:r>
+      <w:proofErr w:type="spellEnd"/>
+      <w:r>
+        <w:rPr>
+          <w:rFonts w:ascii="Arial" w:hAnsi="Arial" w:cs="Arial"/>
+          <w:lang w:val="es-ES"/>
+        </w:rPr>
+        <w:t xml:space="preserve"> </w:t>
+      </w:r>
+      <w:proofErr w:type="spellStart"/>
+      <w:r>
+        <w:rPr>
+          <w:rFonts w:ascii="Arial" w:hAnsi="Arial" w:cs="Arial"/>
+          <w:lang w:val="es-ES"/>
+        </w:rPr>
+        <w:t>uxBitsToWaitFor</w:t>
+      </w:r>
+      <w:proofErr w:type="spellEnd"/>
+      <w:r>
+        <w:rPr>
+          <w:rFonts w:ascii="Arial" w:hAnsi="Arial" w:cs="Arial"/>
+          <w:lang w:val="es-ES"/>
+        </w:rPr>
+        <w:t>, // Bits que ESPERO que estén activos</w:t>
+      </w:r>
+    </w:p>
+    <w:p>
+      <w:pPr>
+        <w:rPr>
+          <w:rFonts w:ascii="Arial" w:hAnsi="Arial" w:cs="Arial"/>
+          <w:lang w:val="es-ES"/>
+        </w:rPr>
+      </w:pPr>
+      <w:r>
+        <w:rPr>
+          <w:rFonts w:ascii="Arial" w:hAnsi="Arial" w:cs="Arial"/>
+          <w:lang w:val="es-ES"/>
+        </w:rPr>
+        <w:t xml:space="preserve">    </w:t>
+      </w:r>
+      <w:proofErr w:type="spellStart"/>
+      <w:r>
+        <w:rPr>
+          <w:rFonts w:ascii="Arial" w:hAnsi="Arial" w:cs="Arial"/>
+          <w:lang w:val="es-ES"/>
+        </w:rPr>
+        <w:t>TickType_t</w:t>
+      </w:r>
+      <w:proofErr w:type="spellEnd"/>
+      <w:r>
+        <w:rPr>
+          <w:rFonts w:ascii="Arial" w:hAnsi="Arial" w:cs="Arial"/>
+          <w:lang w:val="es-ES"/>
+        </w:rPr>
+        <w:t xml:space="preserve"> </w:t>
+      </w:r>
+      <w:proofErr w:type="spellStart"/>
+      <w:r>
+        <w:rPr>
+          <w:rFonts w:ascii="Arial" w:hAnsi="Arial" w:cs="Arial"/>
+          <w:lang w:val="es-ES"/>
+        </w:rPr>
+        <w:t>xTicksToWait</w:t>
+      </w:r>
+      <w:proofErr w:type="spellEnd"/>
+      <w:r>
+        <w:rPr>
+          <w:rFonts w:ascii="Arial" w:hAnsi="Arial" w:cs="Arial"/>
+          <w:lang w:val="es-ES"/>
+        </w:rPr>
+        <w:t xml:space="preserve">          // Tiempo máximo a esperar</w:t>
+      </w:r>
+    </w:p>
+    <w:p>
+      <w:pPr>
+        <w:rPr>
+          <w:rFonts w:ascii="Arial" w:hAnsi="Arial" w:cs="Arial"/>
+          <w:lang w:val="es-ES"/>
+        </w:rPr>
+      </w:pPr>
+      <w:r>
+        <w:rPr>
+          <w:rFonts w:ascii="Arial" w:hAnsi="Arial" w:cs="Arial"/>
+          <w:lang w:val="es-ES"/>
+        </w:rPr>
+        <w:t>);</w:t>
+      </w:r>
+    </w:p>
+    <w:p>
+      <w:pPr>
+        <w:rPr>
+          <w:rFonts w:ascii="Arial" w:hAnsi="Arial" w:cs="Arial"/>
+        </w:rPr>
+      </w:pPr>
+    </w:p>
+    <w:p>
+      <w:pPr>
+        <w:rPr>
+          <w:rFonts w:ascii="Arial" w:hAnsi="Arial" w:cs="Arial"/>
+        </w:rPr>
+      </w:pPr>
+    </w:p>
+    <w:p>
+      <w:pPr>
+        <w:rPr>
+          <w:rFonts w:ascii="Arial" w:hAnsi="Arial" w:cs="Arial"/>
+        </w:rPr>
+      </w:pPr>
+    </w:p>
+    <w:p>
+      <w:pPr>
+        <w:rPr>
+          <w:rFonts w:ascii="Arial" w:hAnsi="Arial" w:cs="Arial"/>
+        </w:rPr>
+      </w:pPr>
+    </w:p>
+    <w:p>
+      <w:pPr>
+        <w:rPr>
+          <w:rFonts w:ascii="Arial" w:hAnsi="Arial" w:cs="Arial"/>
+          <w:b/>
+          <w:bCs/>
+        </w:rPr>
+      </w:pPr>
+      <w:r>
+        <w:rPr>
+          <w:rFonts w:ascii="Arial" w:hAnsi="Arial" w:cs="Arial"/>
+          <w:b/>
+          <w:bCs/>
+        </w:rPr>
+        <w:lastRenderedPageBreak/>
         <w:t>Desarrollo de la actividad:</w:t>
       </w:r>
     </w:p>
@@ -608,7 +1314,7 @@
           <w:noProof/>
         </w:rPr>
         <w:drawing>
-          <wp:inline distT="0" distB="0" distL="0" distR="0" wp14:anchorId="0183355B" wp14:editId="68A9A003">
+          <wp:inline distT="0" distB="0" distL="0" distR="0" wp14:anchorId="0183355B" wp14:editId="1428090D">
             <wp:extent cx="4718050" cy="3538538"/>
             <wp:effectExtent l="0" t="0" r="6350" b="5080"/>
             <wp:docPr id="5" name="Picture 5" descr="A circuit board with wires connected to it&#10;&#10;AI-generated content may be incorrect."/>
@@ -677,6 +1383,34 @@
           <w:rFonts w:ascii="Arial" w:hAnsi="Arial" w:cs="Arial"/>
         </w:rPr>
       </w:pPr>
+    </w:p>
+    <w:p>
+      <w:pPr>
+        <w:rPr>
+          <w:rFonts w:ascii="Arial" w:hAnsi="Arial" w:cs="Arial"/>
+        </w:rPr>
+      </w:pPr>
+    </w:p>
+    <w:p>
+      <w:pPr>
+        <w:rPr>
+          <w:rFonts w:ascii="Arial" w:hAnsi="Arial" w:cs="Arial"/>
+        </w:rPr>
+      </w:pPr>
+    </w:p>
+    <w:p>
+      <w:pPr>
+        <w:rPr>
+          <w:rFonts w:ascii="Arial" w:hAnsi="Arial" w:cs="Arial"/>
+        </w:rPr>
+      </w:pPr>
+    </w:p>
+    <w:p>
+      <w:pPr>
+        <w:rPr>
+          <w:rFonts w:ascii="Arial" w:hAnsi="Arial" w:cs="Arial"/>
+        </w:rPr>
+      </w:pPr>
       <w:r>
         <w:rPr>
           <w:rFonts w:ascii="Arial" w:hAnsi="Arial" w:cs="Arial"/>
@@ -684,28 +1418,24 @@
         <w:lastRenderedPageBreak/>
         <w:t xml:space="preserve">El juego cunado </w:t>
       </w:r>
-      <w:proofErr w:type="spellStart"/>
-      <w:r>
-        <w:rPr>
-          <w:rFonts w:ascii="Arial" w:hAnsi="Arial" w:cs="Arial"/>
-        </w:rPr>
-        <w:t>inica</w:t>
-      </w:r>
-      <w:proofErr w:type="spellEnd"/>
+      <w:r>
+        <w:rPr>
+          <w:rFonts w:ascii="Arial" w:hAnsi="Arial" w:cs="Arial"/>
+        </w:rPr>
+        <w:t>inicia</w:t>
+      </w:r>
       <w:r>
         <w:rPr>
           <w:rFonts w:ascii="Arial" w:hAnsi="Arial" w:cs="Arial"/>
         </w:rPr>
         <w:t xml:space="preserve"> muestra primero un texto antes de </w:t>
       </w:r>
-      <w:proofErr w:type="spellStart"/>
-      <w:r>
-        <w:rPr>
-          <w:rFonts w:ascii="Arial" w:hAnsi="Arial" w:cs="Arial"/>
-        </w:rPr>
-        <w:t>inicar</w:t>
-      </w:r>
-      <w:proofErr w:type="spellEnd"/>
+      <w:r>
+        <w:rPr>
+          <w:rFonts w:ascii="Arial" w:hAnsi="Arial" w:cs="Arial"/>
+        </w:rPr>
+        <w:t>iniciar</w:t>
+      </w:r>
       <w:r>
         <w:rPr>
           <w:rFonts w:ascii="Arial" w:hAnsi="Arial" w:cs="Arial"/>
@@ -725,14 +1455,12 @@
         </w:rPr>
         <w:t xml:space="preserve">Esto </w:t>
       </w:r>
-      <w:proofErr w:type="spellStart"/>
-      <w:r>
-        <w:rPr>
-          <w:rFonts w:ascii="Arial" w:hAnsi="Arial" w:cs="Arial"/>
-        </w:rPr>
-        <w:t>esta</w:t>
-      </w:r>
-      <w:proofErr w:type="spellEnd"/>
+      <w:r>
+        <w:rPr>
+          <w:rFonts w:ascii="Arial" w:hAnsi="Arial" w:cs="Arial"/>
+        </w:rPr>
+        <w:t>está</w:t>
+      </w:r>
       <w:r>
         <w:rPr>
           <w:rFonts w:ascii="Arial" w:hAnsi="Arial" w:cs="Arial"/>
@@ -800,42 +1528,36 @@
         </w:rPr>
         <w:t xml:space="preserve">Una vez que se </w:t>
       </w:r>
-      <w:proofErr w:type="spellStart"/>
-      <w:r>
-        <w:rPr>
-          <w:rFonts w:ascii="Arial" w:hAnsi="Arial" w:cs="Arial"/>
-        </w:rPr>
-        <w:t>preiona</w:t>
-      </w:r>
-      <w:proofErr w:type="spellEnd"/>
+      <w:r>
+        <w:rPr>
+          <w:rFonts w:ascii="Arial" w:hAnsi="Arial" w:cs="Arial"/>
+        </w:rPr>
+        <w:t>presiona</w:t>
+      </w:r>
       <w:r>
         <w:rPr>
           <w:rFonts w:ascii="Arial" w:hAnsi="Arial" w:cs="Arial"/>
         </w:rPr>
         <w:t xml:space="preserve"> el botón que </w:t>
       </w:r>
-      <w:proofErr w:type="spellStart"/>
-      <w:r>
-        <w:rPr>
-          <w:rFonts w:ascii="Arial" w:hAnsi="Arial" w:cs="Arial"/>
-        </w:rPr>
-        <w:t>inica</w:t>
-      </w:r>
-      <w:proofErr w:type="spellEnd"/>
+      <w:r>
+        <w:rPr>
+          <w:rFonts w:ascii="Arial" w:hAnsi="Arial" w:cs="Arial"/>
+        </w:rPr>
+        <w:t>inicia</w:t>
+      </w:r>
       <w:r>
         <w:rPr>
           <w:rFonts w:ascii="Arial" w:hAnsi="Arial" w:cs="Arial"/>
         </w:rPr>
         <w:t xml:space="preserve"> el juego, el juego </w:t>
       </w:r>
-      <w:proofErr w:type="spellStart"/>
-      <w:r>
-        <w:rPr>
-          <w:rFonts w:ascii="Arial" w:hAnsi="Arial" w:cs="Arial"/>
-        </w:rPr>
-        <w:t>inicara</w:t>
-      </w:r>
-      <w:proofErr w:type="spellEnd"/>
+      <w:r>
+        <w:rPr>
+          <w:rFonts w:ascii="Arial" w:hAnsi="Arial" w:cs="Arial"/>
+        </w:rPr>
+        <w:t>iniciara</w:t>
+      </w:r>
     </w:p>
     <w:p>
       <w:pPr>
@@ -910,28 +1632,24 @@
         </w:rPr>
         <w:t xml:space="preserve">En el extremo superior izquierdo nos muestra el tiempo </w:t>
       </w:r>
-      <w:proofErr w:type="spellStart"/>
-      <w:r>
-        <w:rPr>
-          <w:rFonts w:ascii="Arial" w:hAnsi="Arial" w:cs="Arial"/>
-        </w:rPr>
-        <w:t>transcurrdio</w:t>
-      </w:r>
-      <w:proofErr w:type="spellEnd"/>
+      <w:r>
+        <w:rPr>
+          <w:rFonts w:ascii="Arial" w:hAnsi="Arial" w:cs="Arial"/>
+        </w:rPr>
+        <w:t>transcurrido</w:t>
+      </w:r>
       <w:r>
         <w:rPr>
           <w:rFonts w:ascii="Arial" w:hAnsi="Arial" w:cs="Arial"/>
         </w:rPr>
         <w:t xml:space="preserve"> en segundos. Al igual que nos lo </w:t>
       </w:r>
-      <w:proofErr w:type="spellStart"/>
-      <w:r>
-        <w:rPr>
-          <w:rFonts w:ascii="Arial" w:hAnsi="Arial" w:cs="Arial"/>
-        </w:rPr>
-        <w:t>esta</w:t>
-      </w:r>
-      <w:proofErr w:type="spellEnd"/>
+      <w:r>
+        <w:rPr>
+          <w:rFonts w:ascii="Arial" w:hAnsi="Arial" w:cs="Arial"/>
+        </w:rPr>
+        <w:t>está</w:t>
+      </w:r>
       <w:r>
         <w:rPr>
           <w:rFonts w:ascii="Arial" w:hAnsi="Arial" w:cs="Arial"/>
@@ -952,7 +1670,7 @@
         </w:rPr>
         <w:lastRenderedPageBreak/>
         <w:drawing>
-          <wp:inline distT="0" distB="0" distL="0" distR="0" wp14:anchorId="626A4FDA" wp14:editId="1817EB46">
+          <wp:inline distT="0" distB="0" distL="0" distR="0" wp14:anchorId="626A4FDA" wp14:editId="4D280A82">
             <wp:extent cx="4180840" cy="3135630"/>
             <wp:effectExtent l="0" t="0" r="0" b="7620"/>
             <wp:docPr id="21" name="Picture 21" descr="A circuit board with wires connected to it&#10;&#10;AI-generated content may be incorrect."/>
@@ -1006,14 +1724,12 @@
         </w:rPr>
         <w:t xml:space="preserve">En </w:t>
       </w:r>
-      <w:proofErr w:type="spellStart"/>
-      <w:r>
-        <w:rPr>
-          <w:rFonts w:ascii="Arial" w:hAnsi="Arial" w:cs="Arial"/>
-        </w:rPr>
-        <w:t>vehiculo</w:t>
-      </w:r>
-      <w:proofErr w:type="spellEnd"/>
+      <w:r>
+        <w:rPr>
+          <w:rFonts w:ascii="Arial" w:hAnsi="Arial" w:cs="Arial"/>
+        </w:rPr>
+        <w:t>vehículo</w:t>
+      </w:r>
       <w:r>
         <w:rPr>
           <w:rFonts w:ascii="Arial" w:hAnsi="Arial" w:cs="Arial"/>
@@ -1102,42 +1818,36 @@
           <w:rFonts w:ascii="Arial" w:hAnsi="Arial" w:cs="Arial"/>
         </w:rPr>
       </w:pPr>
-      <w:proofErr w:type="spellStart"/>
-      <w:r>
-        <w:rPr>
-          <w:rFonts w:ascii="Arial" w:hAnsi="Arial" w:cs="Arial"/>
-        </w:rPr>
-        <w:t>Cunado</w:t>
-      </w:r>
-      <w:proofErr w:type="spellEnd"/>
+      <w:r>
+        <w:rPr>
+          <w:rFonts w:ascii="Arial" w:hAnsi="Arial" w:cs="Arial"/>
+        </w:rPr>
+        <w:t>Cuando</w:t>
+      </w:r>
       <w:r>
         <w:rPr>
           <w:rFonts w:ascii="Arial" w:hAnsi="Arial" w:cs="Arial"/>
         </w:rPr>
         <w:t xml:space="preserve"> este inicia, </w:t>
       </w:r>
-      <w:proofErr w:type="spellStart"/>
-      <w:r>
-        <w:rPr>
-          <w:rFonts w:ascii="Arial" w:hAnsi="Arial" w:cs="Arial"/>
-        </w:rPr>
-        <w:t>inica</w:t>
-      </w:r>
-      <w:proofErr w:type="spellEnd"/>
+      <w:r>
+        <w:rPr>
+          <w:rFonts w:ascii="Arial" w:hAnsi="Arial" w:cs="Arial"/>
+        </w:rPr>
+        <w:t>inicia</w:t>
+      </w:r>
       <w:r>
         <w:rPr>
           <w:rFonts w:ascii="Arial" w:hAnsi="Arial" w:cs="Arial"/>
         </w:rPr>
         <w:t xml:space="preserve"> en el carril de en medio y los obstáculos aparecen de manera aleatoria entre estos 3 carriles, dejando un hueco de 5 espacios para que el </w:t>
       </w:r>
-      <w:proofErr w:type="spellStart"/>
-      <w:r>
-        <w:rPr>
-          <w:rFonts w:ascii="Arial" w:hAnsi="Arial" w:cs="Arial"/>
-        </w:rPr>
-        <w:t>vehiculo</w:t>
-      </w:r>
-      <w:proofErr w:type="spellEnd"/>
+      <w:r>
+        <w:rPr>
+          <w:rFonts w:ascii="Arial" w:hAnsi="Arial" w:cs="Arial"/>
+        </w:rPr>
+        <w:t>vehículo</w:t>
+      </w:r>
       <w:r>
         <w:rPr>
           <w:rFonts w:ascii="Arial" w:hAnsi="Arial" w:cs="Arial"/>
@@ -1157,14 +1867,12 @@
         </w:rPr>
         <w:t xml:space="preserve">La forma de terminar con el juego es perdiendo, en dado caso muestra un mensaje que “suerte a la </w:t>
       </w:r>
-      <w:proofErr w:type="spellStart"/>
-      <w:r>
-        <w:rPr>
-          <w:rFonts w:ascii="Arial" w:hAnsi="Arial" w:cs="Arial"/>
-        </w:rPr>
-        <w:t>proxima</w:t>
-      </w:r>
-      <w:proofErr w:type="spellEnd"/>
+      <w:r>
+        <w:rPr>
+          <w:rFonts w:ascii="Arial" w:hAnsi="Arial" w:cs="Arial"/>
+        </w:rPr>
+        <w:t>próxima</w:t>
+      </w:r>
       <w:r>
         <w:rPr>
           <w:rFonts w:ascii="Arial" w:hAnsi="Arial" w:cs="Arial"/>
@@ -1367,56 +2075,50 @@
         </w:rPr>
         <w:t xml:space="preserve"> nuestro </w:t>
       </w:r>
+      <w:r>
+        <w:rPr>
+          <w:rFonts w:ascii="Arial" w:hAnsi="Arial" w:cs="Arial"/>
+        </w:rPr>
+        <w:t>vehículo</w:t>
+      </w:r>
+      <w:r>
+        <w:rPr>
+          <w:rFonts w:ascii="Arial" w:hAnsi="Arial" w:cs="Arial"/>
+        </w:rPr>
+        <w:t xml:space="preserve"> y cunado es el espacio mínimo que queremos dejar </w:t>
+      </w:r>
+      <w:r>
+        <w:rPr>
+          <w:rFonts w:ascii="Arial" w:hAnsi="Arial" w:cs="Arial"/>
+        </w:rPr>
+        <w:t>entre</w:t>
+      </w:r>
+      <w:r>
+        <w:rPr>
+          <w:rFonts w:ascii="Arial" w:hAnsi="Arial" w:cs="Arial"/>
+        </w:rPr>
+        <w:t xml:space="preserve"> obstáculos </w:t>
+      </w:r>
       <w:proofErr w:type="spellStart"/>
       <w:r>
         <w:rPr>
           <w:rFonts w:ascii="Arial" w:hAnsi="Arial" w:cs="Arial"/>
         </w:rPr>
-        <w:t>vehiculo</w:t>
+        <w:t>asi</w:t>
       </w:r>
       <w:proofErr w:type="spellEnd"/>
       <w:r>
         <w:rPr>
           <w:rFonts w:ascii="Arial" w:hAnsi="Arial" w:cs="Arial"/>
         </w:rPr>
-        <w:t xml:space="preserve"> y cunado es el espacio mínimo que queremos dejar </w:t>
-      </w:r>
-      <w:proofErr w:type="spellStart"/>
-      <w:r>
-        <w:rPr>
-          <w:rFonts w:ascii="Arial" w:hAnsi="Arial" w:cs="Arial"/>
-        </w:rPr>
-        <w:t>esntre</w:t>
-      </w:r>
-      <w:proofErr w:type="spellEnd"/>
-      <w:r>
-        <w:rPr>
-          <w:rFonts w:ascii="Arial" w:hAnsi="Arial" w:cs="Arial"/>
-        </w:rPr>
-        <w:t xml:space="preserve"> obstáculos </w:t>
-      </w:r>
-      <w:proofErr w:type="spellStart"/>
-      <w:r>
-        <w:rPr>
-          <w:rFonts w:ascii="Arial" w:hAnsi="Arial" w:cs="Arial"/>
-        </w:rPr>
-        <w:t>asi</w:t>
-      </w:r>
-      <w:proofErr w:type="spellEnd"/>
-      <w:r>
-        <w:rPr>
-          <w:rFonts w:ascii="Arial" w:hAnsi="Arial" w:cs="Arial"/>
-        </w:rPr>
         <w:t xml:space="preserve"> que podemos cambiar estas definiciones para cambiar la posición y hasta la dificultad dejando un margen </w:t>
       </w:r>
-      <w:proofErr w:type="spellStart"/>
-      <w:r>
-        <w:rPr>
-          <w:rFonts w:ascii="Arial" w:hAnsi="Arial" w:cs="Arial"/>
-        </w:rPr>
-        <w:t>mas</w:t>
-      </w:r>
-      <w:proofErr w:type="spellEnd"/>
+      <w:r>
+        <w:rPr>
+          <w:rFonts w:ascii="Arial" w:hAnsi="Arial" w:cs="Arial"/>
+        </w:rPr>
+        <w:t>más</w:t>
+      </w:r>
       <w:r>
         <w:rPr>
           <w:rFonts w:ascii="Arial" w:hAnsi="Arial" w:cs="Arial"/>
@@ -1491,14 +2193,12 @@
         </w:rPr>
         <w:t xml:space="preserve">Tenemos otra definición para el formato de la “pantalla” en este caso es de 50 x 10, por lo que esto podría cambiar si </w:t>
       </w:r>
-      <w:proofErr w:type="spellStart"/>
-      <w:r>
-        <w:rPr>
-          <w:rFonts w:ascii="Arial" w:hAnsi="Arial" w:cs="Arial"/>
-        </w:rPr>
-        <w:t>asi</w:t>
-      </w:r>
-      <w:proofErr w:type="spellEnd"/>
+      <w:r>
+        <w:rPr>
+          <w:rFonts w:ascii="Arial" w:hAnsi="Arial" w:cs="Arial"/>
+        </w:rPr>
+        <w:t>así</w:t>
+      </w:r>
       <w:r>
         <w:rPr>
           <w:rFonts w:ascii="Arial" w:hAnsi="Arial" w:cs="Arial"/>
@@ -1573,14 +2273,12 @@
         </w:rPr>
         <w:t xml:space="preserve">Para hacer </w:t>
       </w:r>
-      <w:proofErr w:type="spellStart"/>
-      <w:r>
-        <w:rPr>
-          <w:rFonts w:ascii="Arial" w:hAnsi="Arial" w:cs="Arial"/>
-        </w:rPr>
-        <w:t>mas</w:t>
-      </w:r>
-      <w:proofErr w:type="spellEnd"/>
+      <w:r>
+        <w:rPr>
+          <w:rFonts w:ascii="Arial" w:hAnsi="Arial" w:cs="Arial"/>
+        </w:rPr>
+        <w:t>más</w:t>
+      </w:r>
       <w:r>
         <w:rPr>
           <w:rFonts w:ascii="Arial" w:hAnsi="Arial" w:cs="Arial"/>
@@ -1655,48 +2353,69 @@
         </w:rPr>
         <w:t xml:space="preserve">De ahí en </w:t>
       </w:r>
+      <w:r>
+        <w:rPr>
+          <w:rFonts w:ascii="Arial" w:hAnsi="Arial" w:cs="Arial"/>
+        </w:rPr>
+        <w:t>más</w:t>
+      </w:r>
+      <w:r>
+        <w:rPr>
+          <w:rFonts w:ascii="Arial" w:hAnsi="Arial" w:cs="Arial"/>
+        </w:rPr>
+        <w:t xml:space="preserve"> solo </w:t>
+      </w:r>
+      <w:r>
+        <w:rPr>
+          <w:rFonts w:ascii="Arial" w:hAnsi="Arial" w:cs="Arial"/>
+        </w:rPr>
+        <w:t>tenemos</w:t>
+      </w:r>
+      <w:r>
+        <w:rPr>
+          <w:rFonts w:ascii="Arial" w:hAnsi="Arial" w:cs="Arial"/>
+        </w:rPr>
+        <w:t xml:space="preserve"> definiciones de nuestras funciones. </w:t>
+      </w:r>
+    </w:p>
+    <w:p>
+      <w:pPr>
+        <w:rPr>
+          <w:rFonts w:ascii="Arial" w:hAnsi="Arial" w:cs="Arial"/>
+          <w:b/>
+          <w:bCs/>
+        </w:rPr>
+      </w:pPr>
+      <w:r>
+        <w:rPr>
+          <w:rFonts w:ascii="Arial" w:hAnsi="Arial" w:cs="Arial"/>
+          <w:b/>
+          <w:bCs/>
+        </w:rPr>
+        <w:t xml:space="preserve">Archivo </w:t>
+      </w:r>
       <w:proofErr w:type="spellStart"/>
       <w:r>
         <w:rPr>
           <w:rFonts w:ascii="Arial" w:hAnsi="Arial" w:cs="Arial"/>
-        </w:rPr>
-        <w:t>mas</w:t>
+          <w:b/>
+          <w:bCs/>
+        </w:rPr>
+        <w:t>main.c</w:t>
       </w:r>
       <w:proofErr w:type="spellEnd"/>
-      <w:r>
-        <w:rPr>
-          <w:rFonts w:ascii="Arial" w:hAnsi="Arial" w:cs="Arial"/>
-        </w:rPr>
-        <w:t xml:space="preserve"> solo </w:t>
-      </w:r>
-      <w:r>
-        <w:rPr>
-          <w:rFonts w:ascii="Arial" w:hAnsi="Arial" w:cs="Arial"/>
-        </w:rPr>
-        <w:t>tenemos</w:t>
-      </w:r>
-      <w:r>
-        <w:rPr>
-          <w:rFonts w:ascii="Arial" w:hAnsi="Arial" w:cs="Arial"/>
-        </w:rPr>
-        <w:t xml:space="preserve"> definiciones de nuestras funciones. </w:t>
-      </w:r>
-    </w:p>
-    <w:p>
-      <w:pPr>
-        <w:rPr>
-          <w:rFonts w:ascii="Arial" w:hAnsi="Arial" w:cs="Arial"/>
-          <w:b/>
-          <w:bCs/>
-        </w:rPr>
-      </w:pPr>
-      <w:r>
-        <w:rPr>
-          <w:rFonts w:ascii="Arial" w:hAnsi="Arial" w:cs="Arial"/>
-          <w:b/>
-          <w:bCs/>
-        </w:rPr>
-        <w:t xml:space="preserve">Archivo </w:t>
+    </w:p>
+    <w:p>
+      <w:pPr>
+        <w:rPr>
+          <w:rFonts w:ascii="Arial" w:hAnsi="Arial" w:cs="Arial"/>
+        </w:rPr>
+      </w:pPr>
+      <w:r>
+        <w:rPr>
+          <w:rFonts w:ascii="Arial" w:hAnsi="Arial" w:cs="Arial"/>
+        </w:rPr>
+        <w:t xml:space="preserve">Establecemos 2 matrices, la matriz </w:t>
       </w:r>
       <w:proofErr w:type="spellStart"/>
       <w:r>
@@ -1705,35 +2424,96 @@
           <w:b/>
           <w:bCs/>
         </w:rPr>
-        <w:t>main.c</w:t>
+        <w:t>obstacle</w:t>
       </w:r>
       <w:proofErr w:type="spellEnd"/>
-    </w:p>
-    <w:p>
-      <w:pPr>
-        <w:rPr>
-          <w:rFonts w:ascii="Arial" w:hAnsi="Arial" w:cs="Arial"/>
-        </w:rPr>
-      </w:pPr>
-      <w:r>
-        <w:rPr>
-          <w:rFonts w:ascii="Arial" w:hAnsi="Arial" w:cs="Arial"/>
-        </w:rPr>
-        <w:t xml:space="preserve">Establecemos 2 matrices, la matriz </w:t>
+      <w:r>
+        <w:rPr>
+          <w:rFonts w:ascii="Arial" w:hAnsi="Arial" w:cs="Arial"/>
+          <w:b/>
+          <w:bCs/>
+        </w:rPr>
+        <w:t xml:space="preserve"> </w:t>
+      </w:r>
+      <w:r>
+        <w:rPr>
+          <w:rFonts w:ascii="Arial" w:hAnsi="Arial" w:cs="Arial"/>
+        </w:rPr>
+        <w:t xml:space="preserve">es donde guardaremos en que posición </w:t>
+      </w:r>
+      <w:r>
+        <w:rPr>
+          <w:rFonts w:ascii="Arial" w:hAnsi="Arial" w:cs="Arial"/>
+        </w:rPr>
+        <w:t xml:space="preserve">de los 3 </w:t>
+      </w:r>
+      <w:r>
+        <w:rPr>
+          <w:rFonts w:ascii="Arial" w:hAnsi="Arial" w:cs="Arial"/>
+        </w:rPr>
+        <w:t>carriles</w:t>
+      </w:r>
+      <w:r>
+        <w:rPr>
+          <w:rFonts w:ascii="Arial" w:hAnsi="Arial" w:cs="Arial"/>
+        </w:rPr>
+        <w:t xml:space="preserve"> posibles habrá un obstáculo este se genera de manera </w:t>
       </w:r>
       <w:proofErr w:type="spellStart"/>
       <w:r>
         <w:rPr>
           <w:rFonts w:ascii="Arial" w:hAnsi="Arial" w:cs="Arial"/>
-          <w:b/>
-          <w:bCs/>
-        </w:rPr>
-        <w:t>obstacle</w:t>
+        </w:rPr>
+        <w:t>random</w:t>
       </w:r>
       <w:proofErr w:type="spellEnd"/>
       <w:r>
         <w:rPr>
           <w:rFonts w:ascii="Arial" w:hAnsi="Arial" w:cs="Arial"/>
+        </w:rPr>
+        <w:t xml:space="preserve"> usando </w:t>
+      </w:r>
+      <w:proofErr w:type="spellStart"/>
+      <w:r>
+        <w:rPr>
+          <w:rFonts w:ascii="Arial" w:hAnsi="Arial" w:cs="Arial"/>
+        </w:rPr>
+        <w:t>mla</w:t>
+      </w:r>
+      <w:proofErr w:type="spellEnd"/>
+      <w:r>
+        <w:rPr>
+          <w:rFonts w:ascii="Arial" w:hAnsi="Arial" w:cs="Arial"/>
+        </w:rPr>
+        <w:t xml:space="preserve"> función </w:t>
+      </w:r>
+      <w:r>
+        <w:rPr>
+          <w:rFonts w:ascii="Arial" w:hAnsi="Arial" w:cs="Arial"/>
+          <w:b/>
+          <w:bCs/>
+        </w:rPr>
+        <w:t xml:space="preserve">rand() </w:t>
+      </w:r>
+      <w:r>
+        <w:rPr>
+          <w:rFonts w:ascii="Arial" w:hAnsi="Arial" w:cs="Arial"/>
+        </w:rPr>
+        <w:t xml:space="preserve">y la matriz </w:t>
+      </w:r>
+      <w:proofErr w:type="spellStart"/>
+      <w:r>
+        <w:rPr>
+          <w:rFonts w:ascii="Arial" w:hAnsi="Arial" w:cs="Arial"/>
+          <w:b/>
+          <w:bCs/>
+        </w:rPr>
+        <w:t>canvas</w:t>
+      </w:r>
+      <w:proofErr w:type="spellEnd"/>
+      <w:r>
+        <w:rPr>
+          <w:rFonts w:ascii="Arial" w:hAnsi="Arial" w:cs="Arial"/>
           <w:b/>
           <w:bCs/>
         </w:rPr>
@@ -1743,116 +2523,26 @@
         <w:rPr>
           <w:rFonts w:ascii="Arial" w:hAnsi="Arial" w:cs="Arial"/>
         </w:rPr>
-        <w:t xml:space="preserve">es donde guardaremos en que posición </w:t>
-      </w:r>
-      <w:r>
-        <w:rPr>
-          <w:rFonts w:ascii="Arial" w:hAnsi="Arial" w:cs="Arial"/>
-        </w:rPr>
-        <w:t xml:space="preserve">de los 3 </w:t>
-      </w:r>
-      <w:proofErr w:type="spellStart"/>
-      <w:r>
-        <w:rPr>
-          <w:rFonts w:ascii="Arial" w:hAnsi="Arial" w:cs="Arial"/>
-        </w:rPr>
-        <w:t>carriloes</w:t>
-      </w:r>
-      <w:proofErr w:type="spellEnd"/>
-      <w:r>
-        <w:rPr>
-          <w:rFonts w:ascii="Arial" w:hAnsi="Arial" w:cs="Arial"/>
-        </w:rPr>
-        <w:t xml:space="preserve"> posibles habrá un obstáculo este se genera de manera </w:t>
-      </w:r>
-      <w:proofErr w:type="spellStart"/>
-      <w:r>
-        <w:rPr>
-          <w:rFonts w:ascii="Arial" w:hAnsi="Arial" w:cs="Arial"/>
-        </w:rPr>
-        <w:t>random</w:t>
-      </w:r>
-      <w:proofErr w:type="spellEnd"/>
-      <w:r>
-        <w:rPr>
-          <w:rFonts w:ascii="Arial" w:hAnsi="Arial" w:cs="Arial"/>
-        </w:rPr>
-        <w:t xml:space="preserve"> usando </w:t>
-      </w:r>
-      <w:proofErr w:type="spellStart"/>
-      <w:r>
-        <w:rPr>
-          <w:rFonts w:ascii="Arial" w:hAnsi="Arial" w:cs="Arial"/>
-        </w:rPr>
-        <w:t>mla</w:t>
-      </w:r>
-      <w:proofErr w:type="spellEnd"/>
-      <w:r>
-        <w:rPr>
-          <w:rFonts w:ascii="Arial" w:hAnsi="Arial" w:cs="Arial"/>
-        </w:rPr>
-        <w:t xml:space="preserve"> función </w:t>
-      </w:r>
-      <w:r>
-        <w:rPr>
-          <w:rFonts w:ascii="Arial" w:hAnsi="Arial" w:cs="Arial"/>
-          <w:b/>
-          <w:bCs/>
-        </w:rPr>
-        <w:t xml:space="preserve">rand() </w:t>
-      </w:r>
-      <w:r>
-        <w:rPr>
-          <w:rFonts w:ascii="Arial" w:hAnsi="Arial" w:cs="Arial"/>
-        </w:rPr>
-        <w:t xml:space="preserve">y la matriz </w:t>
-      </w:r>
-      <w:proofErr w:type="spellStart"/>
-      <w:r>
-        <w:rPr>
-          <w:rFonts w:ascii="Arial" w:hAnsi="Arial" w:cs="Arial"/>
-          <w:b/>
-          <w:bCs/>
-        </w:rPr>
-        <w:t>canvas</w:t>
-      </w:r>
-      <w:proofErr w:type="spellEnd"/>
-      <w:r>
-        <w:rPr>
-          <w:rFonts w:ascii="Arial" w:hAnsi="Arial" w:cs="Arial"/>
-          <w:b/>
-          <w:bCs/>
-        </w:rPr>
-        <w:t xml:space="preserve"> </w:t>
-      </w:r>
-      <w:r>
-        <w:rPr>
-          <w:rFonts w:ascii="Arial" w:hAnsi="Arial" w:cs="Arial"/>
-        </w:rPr>
         <w:t xml:space="preserve">es la que </w:t>
       </w:r>
-      <w:proofErr w:type="spellStart"/>
-      <w:r>
-        <w:rPr>
-          <w:rFonts w:ascii="Arial" w:hAnsi="Arial" w:cs="Arial"/>
-        </w:rPr>
-        <w:t>presentena</w:t>
-      </w:r>
-      <w:proofErr w:type="spellEnd"/>
+      <w:r>
+        <w:rPr>
+          <w:rFonts w:ascii="Arial" w:hAnsi="Arial" w:cs="Arial"/>
+        </w:rPr>
+        <w:t>presenta</w:t>
+      </w:r>
       <w:r>
         <w:rPr>
           <w:rFonts w:ascii="Arial" w:hAnsi="Arial" w:cs="Arial"/>
         </w:rPr>
         <w:t xml:space="preserve"> por </w:t>
       </w:r>
-      <w:proofErr w:type="spellStart"/>
-      <w:r>
-        <w:rPr>
-          <w:rFonts w:ascii="Arial" w:hAnsi="Arial" w:cs="Arial"/>
-        </w:rPr>
-        <w:t>asi</w:t>
-      </w:r>
-      <w:proofErr w:type="spellEnd"/>
+      <w:r>
+        <w:rPr>
+          <w:rFonts w:ascii="Arial" w:hAnsi="Arial" w:cs="Arial"/>
+        </w:rPr>
+        <w:t>así</w:t>
+      </w:r>
       <w:r>
         <w:rPr>
           <w:rFonts w:ascii="Arial" w:hAnsi="Arial" w:cs="Arial"/>
@@ -1873,42 +2563,36 @@
         </w:rPr>
         <w:t xml:space="preserve">” es en donde se estará mostrando los obstáculos y nuestro </w:t>
       </w:r>
-      <w:proofErr w:type="spellStart"/>
-      <w:r>
-        <w:rPr>
-          <w:rFonts w:ascii="Arial" w:hAnsi="Arial" w:cs="Arial"/>
-        </w:rPr>
-        <w:t>vehiculo</w:t>
-      </w:r>
-      <w:proofErr w:type="spellEnd"/>
+      <w:r>
+        <w:rPr>
+          <w:rFonts w:ascii="Arial" w:hAnsi="Arial" w:cs="Arial"/>
+        </w:rPr>
+        <w:t>vehículo</w:t>
+      </w:r>
       <w:r>
         <w:rPr>
           <w:rFonts w:ascii="Arial" w:hAnsi="Arial" w:cs="Arial"/>
         </w:rPr>
         <w:t xml:space="preserve">, </w:t>
       </w:r>
-      <w:proofErr w:type="spellStart"/>
-      <w:r>
-        <w:rPr>
-          <w:rFonts w:ascii="Arial" w:hAnsi="Arial" w:cs="Arial"/>
-        </w:rPr>
-        <w:t>asi</w:t>
-      </w:r>
-      <w:proofErr w:type="spellEnd"/>
+      <w:r>
+        <w:rPr>
+          <w:rFonts w:ascii="Arial" w:hAnsi="Arial" w:cs="Arial"/>
+        </w:rPr>
+        <w:t>así</w:t>
+      </w:r>
       <w:r>
         <w:rPr>
           <w:rFonts w:ascii="Arial" w:hAnsi="Arial" w:cs="Arial"/>
         </w:rPr>
         <w:t xml:space="preserve"> como el tiempo que ha </w:t>
       </w:r>
-      <w:proofErr w:type="spellStart"/>
-      <w:r>
-        <w:rPr>
-          <w:rFonts w:ascii="Arial" w:hAnsi="Arial" w:cs="Arial"/>
-        </w:rPr>
-        <w:t>pasdo</w:t>
-      </w:r>
-      <w:proofErr w:type="spellEnd"/>
+      <w:r>
+        <w:rPr>
+          <w:rFonts w:ascii="Arial" w:hAnsi="Arial" w:cs="Arial"/>
+        </w:rPr>
+        <w:t>pasado</w:t>
+      </w:r>
       <w:r>
         <w:rPr>
           <w:rFonts w:ascii="Arial" w:hAnsi="Arial" w:cs="Arial"/>
@@ -1984,66 +2668,62 @@
         <w:lastRenderedPageBreak/>
         <w:t xml:space="preserve">En nuestra función que </w:t>
       </w:r>
+      <w:r>
+        <w:rPr>
+          <w:rFonts w:ascii="Arial" w:hAnsi="Arial" w:cs="Arial"/>
+        </w:rPr>
+        <w:t>está</w:t>
+      </w:r>
+      <w:r>
+        <w:rPr>
+          <w:rFonts w:ascii="Arial" w:hAnsi="Arial" w:cs="Arial"/>
+        </w:rPr>
+        <w:t xml:space="preserve"> tratando la interrupción de cunado </w:t>
+      </w:r>
+      <w:r>
+        <w:rPr>
+          <w:rFonts w:ascii="Arial" w:hAnsi="Arial" w:cs="Arial"/>
+        </w:rPr>
+        <w:t xml:space="preserve">se </w:t>
+      </w:r>
+      <w:r>
+        <w:rPr>
+          <w:rFonts w:ascii="Arial" w:hAnsi="Arial" w:cs="Arial"/>
+        </w:rPr>
+        <w:t>presiona</w:t>
+      </w:r>
+      <w:r>
+        <w:rPr>
+          <w:rFonts w:ascii="Arial" w:hAnsi="Arial" w:cs="Arial"/>
+        </w:rPr>
+        <w:t xml:space="preserve"> un botón, para los botones, </w:t>
+      </w:r>
+      <w:r>
+        <w:rPr>
+          <w:rFonts w:ascii="Arial" w:hAnsi="Arial" w:cs="Arial"/>
+          <w:b/>
+          <w:bCs/>
+        </w:rPr>
+        <w:t xml:space="preserve">_UP_, _DOWN_,_FINISH_, </w:t>
+      </w:r>
+      <w:r>
+        <w:rPr>
+          <w:rFonts w:ascii="Arial" w:hAnsi="Arial" w:cs="Arial"/>
+        </w:rPr>
+        <w:t xml:space="preserve">que son los que indican si se mueve hacia arriba, hacia abajo, o finalizo el juego, pero antes es necesario un proceso </w:t>
+      </w:r>
       <w:proofErr w:type="spellStart"/>
       <w:r>
         <w:rPr>
           <w:rFonts w:ascii="Arial" w:hAnsi="Arial" w:cs="Arial"/>
         </w:rPr>
-        <w:t>esta</w:t>
+        <w:t>antirebote</w:t>
       </w:r>
       <w:proofErr w:type="spellEnd"/>
       <w:r>
         <w:rPr>
           <w:rFonts w:ascii="Arial" w:hAnsi="Arial" w:cs="Arial"/>
         </w:rPr>
-        <w:t xml:space="preserve"> tratando la interrupción de cunado </w:t>
-      </w:r>
-      <w:r>
-        <w:rPr>
-          <w:rFonts w:ascii="Arial" w:hAnsi="Arial" w:cs="Arial"/>
-        </w:rPr>
-        <w:t xml:space="preserve">se </w:t>
-      </w:r>
-      <w:proofErr w:type="spellStart"/>
-      <w:r>
-        <w:rPr>
-          <w:rFonts w:ascii="Arial" w:hAnsi="Arial" w:cs="Arial"/>
-        </w:rPr>
-        <w:t>preciona</w:t>
-      </w:r>
-      <w:proofErr w:type="spellEnd"/>
-      <w:r>
-        <w:rPr>
-          <w:rFonts w:ascii="Arial" w:hAnsi="Arial" w:cs="Arial"/>
-        </w:rPr>
-        <w:t xml:space="preserve"> un botón, para los botones, </w:t>
-      </w:r>
-      <w:r>
-        <w:rPr>
-          <w:rFonts w:ascii="Arial" w:hAnsi="Arial" w:cs="Arial"/>
-          <w:b/>
-          <w:bCs/>
-        </w:rPr>
-        <w:t xml:space="preserve">_UP_, _DOWN_,_FINISH_, </w:t>
-      </w:r>
-      <w:r>
-        <w:rPr>
-          <w:rFonts w:ascii="Arial" w:hAnsi="Arial" w:cs="Arial"/>
-        </w:rPr>
-        <w:t xml:space="preserve">que son los que indican si se mueve hacia arriba, hacia abajo, o finalizo el juego, pero antes es necesario un proceso </w:t>
-      </w:r>
-      <w:proofErr w:type="spellStart"/>
-      <w:r>
-        <w:rPr>
-          <w:rFonts w:ascii="Arial" w:hAnsi="Arial" w:cs="Arial"/>
-        </w:rPr>
-        <w:t>antirebote</w:t>
-      </w:r>
-      <w:proofErr w:type="spellEnd"/>
-      <w:r>
-        <w:rPr>
-          <w:rFonts w:ascii="Arial" w:hAnsi="Arial" w:cs="Arial"/>
-        </w:rPr>
         <w:t xml:space="preserve"> por software, </w:t>
       </w:r>
       <w:r>
@@ -2066,14 +2746,12 @@
         </w:rPr>
         <w:t xml:space="preserve">porque?, mi idea es que se quedase en la “pantalla de inicio” hasta que se presionase </w:t>
       </w:r>
-      <w:proofErr w:type="spellStart"/>
-      <w:r>
-        <w:rPr>
-          <w:rFonts w:ascii="Arial" w:hAnsi="Arial" w:cs="Arial"/>
-        </w:rPr>
-        <w:t>inicar</w:t>
-      </w:r>
-      <w:proofErr w:type="spellEnd"/>
+      <w:r>
+        <w:rPr>
+          <w:rFonts w:ascii="Arial" w:hAnsi="Arial" w:cs="Arial"/>
+        </w:rPr>
+        <w:t>iniciar</w:t>
+      </w:r>
       <w:r>
         <w:rPr>
           <w:rFonts w:ascii="Arial" w:hAnsi="Arial" w:cs="Arial"/>
@@ -2086,28 +2764,24 @@
         </w:rPr>
         <w:t xml:space="preserve">entonces para esto use un grupo de eventos que indican en la tarea principal cunado se </w:t>
       </w:r>
-      <w:proofErr w:type="spellStart"/>
-      <w:r>
-        <w:rPr>
-          <w:rFonts w:ascii="Arial" w:hAnsi="Arial" w:cs="Arial"/>
-        </w:rPr>
-        <w:t>presiono</w:t>
-      </w:r>
-      <w:proofErr w:type="spellEnd"/>
+      <w:r>
+        <w:rPr>
+          <w:rFonts w:ascii="Arial" w:hAnsi="Arial" w:cs="Arial"/>
+        </w:rPr>
+        <w:t>presionó</w:t>
+      </w:r>
       <w:r>
         <w:rPr>
           <w:rFonts w:ascii="Arial" w:hAnsi="Arial" w:cs="Arial"/>
         </w:rPr>
         <w:t xml:space="preserve"> el botón entonces podrá </w:t>
       </w:r>
-      <w:proofErr w:type="spellStart"/>
-      <w:r>
-        <w:rPr>
-          <w:rFonts w:ascii="Arial" w:hAnsi="Arial" w:cs="Arial"/>
-        </w:rPr>
-        <w:t>continar</w:t>
-      </w:r>
-      <w:proofErr w:type="spellEnd"/>
+      <w:r>
+        <w:rPr>
+          <w:rFonts w:ascii="Arial" w:hAnsi="Arial" w:cs="Arial"/>
+        </w:rPr>
+        <w:t>continuar</w:t>
+      </w:r>
       <w:r>
         <w:rPr>
           <w:rFonts w:ascii="Arial" w:hAnsi="Arial" w:cs="Arial"/>
@@ -2120,28 +2794,24 @@
         </w:rPr>
         <w:t xml:space="preserve">Esto solo apsara en </w:t>
       </w:r>
-      <w:proofErr w:type="spellStart"/>
-      <w:r>
-        <w:rPr>
-          <w:rFonts w:ascii="Arial" w:hAnsi="Arial" w:cs="Arial"/>
-        </w:rPr>
-        <w:t>cunto</w:t>
-      </w:r>
-      <w:proofErr w:type="spellEnd"/>
+      <w:r>
+        <w:rPr>
+          <w:rFonts w:ascii="Arial" w:hAnsi="Arial" w:cs="Arial"/>
+        </w:rPr>
+        <w:t>cuanto</w:t>
+      </w:r>
       <w:r>
         <w:rPr>
           <w:rFonts w:ascii="Arial" w:hAnsi="Arial" w:cs="Arial"/>
         </w:rPr>
         <w:t xml:space="preserve"> se </w:t>
       </w:r>
-      <w:proofErr w:type="spellStart"/>
-      <w:r>
-        <w:rPr>
-          <w:rFonts w:ascii="Arial" w:hAnsi="Arial" w:cs="Arial"/>
-        </w:rPr>
-        <w:t>inica</w:t>
-      </w:r>
-      <w:proofErr w:type="spellEnd"/>
+      <w:r>
+        <w:rPr>
+          <w:rFonts w:ascii="Arial" w:hAnsi="Arial" w:cs="Arial"/>
+        </w:rPr>
+        <w:t>inicia</w:t>
+      </w:r>
       <w:r>
         <w:rPr>
           <w:rFonts w:ascii="Arial" w:hAnsi="Arial" w:cs="Arial"/>
@@ -2154,28 +2824,24 @@
         </w:rPr>
         <w:t xml:space="preserve">, en los 4 casos enviamos que botón se </w:t>
       </w:r>
-      <w:proofErr w:type="spellStart"/>
-      <w:r>
-        <w:rPr>
-          <w:rFonts w:ascii="Arial" w:hAnsi="Arial" w:cs="Arial"/>
-        </w:rPr>
-        <w:t>preciono</w:t>
-      </w:r>
-      <w:proofErr w:type="spellEnd"/>
+      <w:r>
+        <w:rPr>
+          <w:rFonts w:ascii="Arial" w:hAnsi="Arial" w:cs="Arial"/>
+        </w:rPr>
+        <w:t>presionó</w:t>
+      </w:r>
       <w:r>
         <w:rPr>
           <w:rFonts w:ascii="Arial" w:hAnsi="Arial" w:cs="Arial"/>
         </w:rPr>
         <w:t xml:space="preserve"> a </w:t>
       </w:r>
-      <w:proofErr w:type="spellStart"/>
-      <w:r>
-        <w:rPr>
-          <w:rFonts w:ascii="Arial" w:hAnsi="Arial" w:cs="Arial"/>
-        </w:rPr>
-        <w:t>travez</w:t>
-      </w:r>
-      <w:proofErr w:type="spellEnd"/>
+      <w:r>
+        <w:rPr>
+          <w:rFonts w:ascii="Arial" w:hAnsi="Arial" w:cs="Arial"/>
+        </w:rPr>
+        <w:t>través</w:t>
+      </w:r>
       <w:r>
         <w:rPr>
           <w:rFonts w:ascii="Arial" w:hAnsi="Arial" w:cs="Arial"/>
@@ -2192,13 +2858,12 @@
       <w:r>
         <w:rPr>
           <w:rFonts w:ascii="Arial" w:hAnsi="Arial" w:cs="Arial"/>
-          <w:noProof/>
         </w:rPr>
         <w:drawing>
-          <wp:inline distT="0" distB="0" distL="0" distR="0" wp14:anchorId="12D655C7" wp14:editId="2561786A">
-            <wp:extent cx="6166816" cy="3511550"/>
-            <wp:effectExtent l="0" t="0" r="5715" b="0"/>
-            <wp:docPr id="29" name="Picture 29"/>
+          <wp:inline distT="0" distB="0" distL="0" distR="0" wp14:anchorId="2D07A46A" wp14:editId="4C490FF9">
+            <wp:extent cx="4983480" cy="6568440"/>
+            <wp:effectExtent l="0" t="0" r="7620" b="3810"/>
+            <wp:docPr id="10" name="Picture 10"/>
             <wp:cNvGraphicFramePr>
               <a:graphicFrameLocks xmlns:a="http://schemas.openxmlformats.org/drawingml/2006/main" noChangeAspect="1"/>
             </wp:cNvGraphicFramePr>
@@ -2211,13 +2876,13 @@
                   </pic:nvPicPr>
                   <pic:blipFill rotWithShape="1">
                     <a:blip r:embed="rId19"/>
-                    <a:srcRect l="3292" t="4434" r="4398" b="5463"/>
+                    <a:srcRect l="4233" t="3143" r="3480" b="3432"/>
                     <a:stretch/>
                   </pic:blipFill>
                   <pic:spPr bwMode="auto">
                     <a:xfrm>
                       <a:off x="0" y="0"/>
-                      <a:ext cx="6171313" cy="3514111"/>
+                      <a:ext cx="4983480" cy="6568440"/>
                     </a:xfrm>
                     <a:prstGeom prst="rect">
                       <a:avLst/>
@@ -2249,76 +2914,6 @@
       <w:pPr>
         <w:rPr>
           <w:rFonts w:ascii="Arial" w:hAnsi="Arial" w:cs="Arial"/>
-        </w:rPr>
-      </w:pPr>
-    </w:p>
-    <w:p>
-      <w:pPr>
-        <w:rPr>
-          <w:rFonts w:ascii="Arial" w:hAnsi="Arial" w:cs="Arial"/>
-        </w:rPr>
-      </w:pPr>
-    </w:p>
-    <w:p>
-      <w:pPr>
-        <w:rPr>
-          <w:rFonts w:ascii="Arial" w:hAnsi="Arial" w:cs="Arial"/>
-        </w:rPr>
-      </w:pPr>
-    </w:p>
-    <w:p>
-      <w:pPr>
-        <w:rPr>
-          <w:rFonts w:ascii="Arial" w:hAnsi="Arial" w:cs="Arial"/>
-        </w:rPr>
-      </w:pPr>
-    </w:p>
-    <w:p>
-      <w:pPr>
-        <w:rPr>
-          <w:rFonts w:ascii="Arial" w:hAnsi="Arial" w:cs="Arial"/>
-        </w:rPr>
-      </w:pPr>
-    </w:p>
-    <w:p>
-      <w:pPr>
-        <w:rPr>
-          <w:rFonts w:ascii="Arial" w:hAnsi="Arial" w:cs="Arial"/>
-        </w:rPr>
-      </w:pPr>
-    </w:p>
-    <w:p>
-      <w:pPr>
-        <w:rPr>
-          <w:rFonts w:ascii="Arial" w:hAnsi="Arial" w:cs="Arial"/>
-        </w:rPr>
-      </w:pPr>
-    </w:p>
-    <w:p>
-      <w:pPr>
-        <w:rPr>
-          <w:rFonts w:ascii="Arial" w:hAnsi="Arial" w:cs="Arial"/>
-        </w:rPr>
-      </w:pPr>
-    </w:p>
-    <w:p>
-      <w:pPr>
-        <w:rPr>
-          <w:rFonts w:ascii="Arial" w:hAnsi="Arial" w:cs="Arial"/>
-        </w:rPr>
-      </w:pPr>
-    </w:p>
-    <w:p>
-      <w:pPr>
-        <w:rPr>
-          <w:rFonts w:ascii="Arial" w:hAnsi="Arial" w:cs="Arial"/>
-        </w:rPr>
-      </w:pPr>
-    </w:p>
-    <w:p>
-      <w:pPr>
-        <w:rPr>
-          <w:rFonts w:ascii="Arial" w:hAnsi="Arial" w:cs="Arial"/>
           <w:b/>
           <w:bCs/>
         </w:rPr>
@@ -2345,75 +2940,67 @@
         </w:rPr>
         <w:t xml:space="preserve">Como se </w:t>
       </w:r>
+      <w:r>
+        <w:rPr>
+          <w:rFonts w:ascii="Arial" w:hAnsi="Arial" w:cs="Arial"/>
+        </w:rPr>
+        <w:t>indicó</w:t>
+      </w:r>
+      <w:r>
+        <w:rPr>
+          <w:rFonts w:ascii="Arial" w:hAnsi="Arial" w:cs="Arial"/>
+        </w:rPr>
+        <w:t xml:space="preserve"> anteriormente lo primero que verifica la tarea es que el bit que </w:t>
+      </w:r>
+      <w:r>
+        <w:rPr>
+          <w:rFonts w:ascii="Arial" w:hAnsi="Arial" w:cs="Arial"/>
+        </w:rPr>
+        <w:t>indica</w:t>
+      </w:r>
+      <w:r>
+        <w:rPr>
+          <w:rFonts w:ascii="Arial" w:hAnsi="Arial" w:cs="Arial"/>
+        </w:rPr>
+        <w:t xml:space="preserve"> que se </w:t>
+      </w:r>
+      <w:r>
+        <w:rPr>
+          <w:rFonts w:ascii="Arial" w:hAnsi="Arial" w:cs="Arial"/>
+        </w:rPr>
+        <w:t>activó</w:t>
+      </w:r>
+      <w:r>
+        <w:rPr>
+          <w:rFonts w:ascii="Arial" w:hAnsi="Arial" w:cs="Arial"/>
+        </w:rPr>
+        <w:t xml:space="preserve"> el </w:t>
+      </w:r>
+      <w:r>
+        <w:rPr>
+          <w:rFonts w:ascii="Arial" w:hAnsi="Arial" w:cs="Arial"/>
+        </w:rPr>
+        <w:t>inicio</w:t>
+      </w:r>
+      <w:r>
+        <w:rPr>
+          <w:rFonts w:ascii="Arial" w:hAnsi="Arial" w:cs="Arial"/>
+        </w:rPr>
+        <w:t xml:space="preserve"> se haya activado, para eso se hace uso de la función </w:t>
+      </w:r>
       <w:proofErr w:type="spellStart"/>
       <w:r>
         <w:rPr>
           <w:rFonts w:ascii="Arial" w:hAnsi="Arial" w:cs="Arial"/>
-        </w:rPr>
-        <w:t>indico</w:t>
+          <w:b/>
+          <w:bCs/>
+        </w:rPr>
+        <w:t>xEventGroupWaitBits</w:t>
       </w:r>
       <w:proofErr w:type="spellEnd"/>
       <w:r>
         <w:rPr>
           <w:rFonts w:ascii="Arial" w:hAnsi="Arial" w:cs="Arial"/>
-        </w:rPr>
-        <w:t xml:space="preserve"> anteriormente lo primero que verifica la tarea es que el bit que </w:t>
-      </w:r>
-      <w:proofErr w:type="spellStart"/>
-      <w:r>
-        <w:rPr>
-          <w:rFonts w:ascii="Arial" w:hAnsi="Arial" w:cs="Arial"/>
-        </w:rPr>
-        <w:t>inidica</w:t>
-      </w:r>
-      <w:proofErr w:type="spellEnd"/>
-      <w:r>
-        <w:rPr>
-          <w:rFonts w:ascii="Arial" w:hAnsi="Arial" w:cs="Arial"/>
-        </w:rPr>
-        <w:t xml:space="preserve"> que se </w:t>
-      </w:r>
-      <w:proofErr w:type="spellStart"/>
-      <w:r>
-        <w:rPr>
-          <w:rFonts w:ascii="Arial" w:hAnsi="Arial" w:cs="Arial"/>
-        </w:rPr>
-        <w:t>activo</w:t>
-      </w:r>
-      <w:proofErr w:type="spellEnd"/>
-      <w:r>
-        <w:rPr>
-          <w:rFonts w:ascii="Arial" w:hAnsi="Arial" w:cs="Arial"/>
-        </w:rPr>
-        <w:t xml:space="preserve"> el </w:t>
-      </w:r>
-      <w:proofErr w:type="spellStart"/>
-      <w:r>
-        <w:rPr>
-          <w:rFonts w:ascii="Arial" w:hAnsi="Arial" w:cs="Arial"/>
-        </w:rPr>
-        <w:t>inico</w:t>
-      </w:r>
-      <w:proofErr w:type="spellEnd"/>
-      <w:r>
-        <w:rPr>
-          <w:rFonts w:ascii="Arial" w:hAnsi="Arial" w:cs="Arial"/>
-        </w:rPr>
-        <w:t xml:space="preserve"> se haya activado, para eso se hace uso de la función </w:t>
-      </w:r>
-      <w:proofErr w:type="spellStart"/>
-      <w:r>
-        <w:rPr>
-          <w:rFonts w:ascii="Arial" w:hAnsi="Arial" w:cs="Arial"/>
-          <w:b/>
-          <w:bCs/>
-        </w:rPr>
-        <w:t>xEventGroupWaitBits</w:t>
-      </w:r>
-      <w:proofErr w:type="spellEnd"/>
-      <w:r>
-        <w:rPr>
-          <w:rFonts w:ascii="Arial" w:hAnsi="Arial" w:cs="Arial"/>
           <w:b/>
           <w:bCs/>
         </w:rPr>
@@ -2438,14 +3025,12 @@
         </w:rPr>
         <w:t xml:space="preserve">Lo primero que se hace en </w:t>
       </w:r>
-      <w:proofErr w:type="spellStart"/>
-      <w:r>
-        <w:rPr>
-          <w:rFonts w:ascii="Arial" w:hAnsi="Arial" w:cs="Arial"/>
-        </w:rPr>
-        <w:t>entonro</w:t>
-      </w:r>
-      <w:proofErr w:type="spellEnd"/>
+      <w:r>
+        <w:rPr>
+          <w:rFonts w:ascii="Arial" w:hAnsi="Arial" w:cs="Arial"/>
+        </w:rPr>
+        <w:t>entorno</w:t>
+      </w:r>
       <w:r>
         <w:rPr>
           <w:rFonts w:ascii="Arial" w:hAnsi="Arial" w:cs="Arial"/>
@@ -2554,485 +3139,451 @@
         </w:rPr>
         <w:t xml:space="preserve">Lo siguiente es que </w:t>
       </w:r>
+      <w:r>
+        <w:rPr>
+          <w:rFonts w:ascii="Arial" w:hAnsi="Arial" w:cs="Arial"/>
+        </w:rPr>
+        <w:t>está</w:t>
+      </w:r>
+      <w:r>
+        <w:rPr>
+          <w:rFonts w:ascii="Arial" w:hAnsi="Arial" w:cs="Arial"/>
+        </w:rPr>
+        <w:t xml:space="preserve"> esperando a que botón es el que se </w:t>
+      </w:r>
+      <w:r>
+        <w:rPr>
+          <w:rFonts w:ascii="Arial" w:hAnsi="Arial" w:cs="Arial"/>
+        </w:rPr>
+        <w:t>presionara</w:t>
+      </w:r>
+      <w:r>
+        <w:rPr>
+          <w:rFonts w:ascii="Arial" w:hAnsi="Arial" w:cs="Arial"/>
+        </w:rPr>
+        <w:t xml:space="preserve"> después esto se recibe </w:t>
+      </w:r>
+      <w:r>
+        <w:rPr>
+          <w:rFonts w:ascii="Arial" w:hAnsi="Arial" w:cs="Arial"/>
+        </w:rPr>
+        <w:t>de</w:t>
+      </w:r>
+      <w:r>
+        <w:rPr>
+          <w:rFonts w:ascii="Arial" w:hAnsi="Arial" w:cs="Arial"/>
+        </w:rPr>
+        <w:t xml:space="preserve"> la ISR a </w:t>
+      </w:r>
+      <w:r>
+        <w:rPr>
+          <w:rFonts w:ascii="Arial" w:hAnsi="Arial" w:cs="Arial"/>
+        </w:rPr>
+        <w:t>través</w:t>
+      </w:r>
+      <w:r>
+        <w:rPr>
+          <w:rFonts w:ascii="Arial" w:hAnsi="Arial" w:cs="Arial"/>
+        </w:rPr>
+        <w:t xml:space="preserve"> de la cola. </w:t>
+      </w:r>
+      <w:r>
+        <w:rPr>
+          <w:rFonts w:ascii="Arial" w:hAnsi="Arial" w:cs="Arial"/>
+        </w:rPr>
+        <w:t xml:space="preserve">Esto hará ir al </w:t>
+      </w:r>
+      <w:r>
+        <w:rPr>
+          <w:rFonts w:ascii="Arial" w:hAnsi="Arial" w:cs="Arial"/>
+        </w:rPr>
+        <w:t>vehículo</w:t>
+      </w:r>
+      <w:r>
+        <w:rPr>
+          <w:rFonts w:ascii="Arial" w:hAnsi="Arial" w:cs="Arial"/>
+        </w:rPr>
+        <w:t xml:space="preserve"> hacia arriba o hacia abajo limitando el rango en que se puede desplazar el </w:t>
+      </w:r>
+      <w:r>
+        <w:rPr>
+          <w:rFonts w:ascii="Arial" w:hAnsi="Arial" w:cs="Arial"/>
+        </w:rPr>
+        <w:t>vehículo</w:t>
+      </w:r>
+      <w:r>
+        <w:rPr>
+          <w:rFonts w:ascii="Arial" w:hAnsi="Arial" w:cs="Arial"/>
+        </w:rPr>
+        <w:t xml:space="preserve">, porque si no se limita puede irse </w:t>
+      </w:r>
+      <w:r>
+        <w:rPr>
+          <w:rFonts w:ascii="Arial" w:hAnsi="Arial" w:cs="Arial"/>
+        </w:rPr>
+        <w:t>más</w:t>
+      </w:r>
+      <w:r>
+        <w:rPr>
+          <w:rFonts w:ascii="Arial" w:hAnsi="Arial" w:cs="Arial"/>
+        </w:rPr>
+        <w:t xml:space="preserve"> allá de la matriz o de la “pantalla” </w:t>
+      </w:r>
+      <w:r>
+        <w:rPr>
+          <w:rFonts w:ascii="Arial" w:hAnsi="Arial" w:cs="Arial"/>
+        </w:rPr>
+        <w:t>permitida</w:t>
+      </w:r>
+      <w:r>
+        <w:rPr>
+          <w:rFonts w:ascii="Arial" w:hAnsi="Arial" w:cs="Arial"/>
+        </w:rPr>
+        <w:t xml:space="preserve"> y causara un bug. </w:t>
+      </w:r>
+      <w:r>
+        <w:rPr>
+          <w:rFonts w:ascii="Arial" w:hAnsi="Arial" w:cs="Arial"/>
+        </w:rPr>
+        <w:t xml:space="preserve">Por lo que indicamos condiciones por el caso que el jugador este presionando constantemente un botón ya sea el de subir o el de bajar. </w:t>
+      </w:r>
+    </w:p>
+    <w:p>
+      <w:pPr>
+        <w:rPr>
+          <w:rFonts w:ascii="Arial" w:hAnsi="Arial" w:cs="Arial"/>
+        </w:rPr>
+      </w:pPr>
+      <w:r>
+        <w:rPr>
+          <w:rFonts w:ascii="Arial" w:hAnsi="Arial" w:cs="Arial"/>
+        </w:rPr>
+        <w:t xml:space="preserve">Si no se </w:t>
+      </w:r>
+      <w:r>
+        <w:rPr>
+          <w:rFonts w:ascii="Arial" w:hAnsi="Arial" w:cs="Arial"/>
+        </w:rPr>
+        <w:t>decidió</w:t>
+      </w:r>
+      <w:r>
+        <w:rPr>
+          <w:rFonts w:ascii="Arial" w:hAnsi="Arial" w:cs="Arial"/>
+        </w:rPr>
+        <w:t xml:space="preserve"> terminar con el juego lo que sigue el mover el </w:t>
+      </w:r>
+      <w:r>
+        <w:rPr>
+          <w:rFonts w:ascii="Arial" w:hAnsi="Arial" w:cs="Arial"/>
+        </w:rPr>
+        <w:t>vehículo</w:t>
+      </w:r>
+      <w:r>
+        <w:rPr>
+          <w:rFonts w:ascii="Arial" w:hAnsi="Arial" w:cs="Arial"/>
+        </w:rPr>
+        <w:t xml:space="preserve">, esto lo hacemos con la función </w:t>
+      </w:r>
       <w:proofErr w:type="spellStart"/>
       <w:r>
         <w:rPr>
           <w:rFonts w:ascii="Arial" w:hAnsi="Arial" w:cs="Arial"/>
-        </w:rPr>
-        <w:t>esta</w:t>
+          <w:b/>
+          <w:bCs/>
+        </w:rPr>
+        <w:t>move_vehicle</w:t>
       </w:r>
       <w:proofErr w:type="spellEnd"/>
       <w:r>
         <w:rPr>
           <w:rFonts w:ascii="Arial" w:hAnsi="Arial" w:cs="Arial"/>
-        </w:rPr>
-        <w:t xml:space="preserve"> esperando a que botón es el que se </w:t>
+          <w:b/>
+          <w:bCs/>
+        </w:rPr>
+        <w:t xml:space="preserve">() </w:t>
+      </w:r>
+      <w:r>
+        <w:rPr>
+          <w:rFonts w:ascii="Arial" w:hAnsi="Arial" w:cs="Arial"/>
+        </w:rPr>
+        <w:t xml:space="preserve">que mueve el </w:t>
+      </w:r>
+      <w:r>
+        <w:rPr>
+          <w:rFonts w:ascii="Arial" w:hAnsi="Arial" w:cs="Arial"/>
+        </w:rPr>
+        <w:t>vehículo</w:t>
+      </w:r>
+      <w:r>
+        <w:rPr>
+          <w:rFonts w:ascii="Arial" w:hAnsi="Arial" w:cs="Arial"/>
+        </w:rPr>
+        <w:t xml:space="preserve"> dentro del </w:t>
       </w:r>
       <w:proofErr w:type="spellStart"/>
       <w:r>
         <w:rPr>
           <w:rFonts w:ascii="Arial" w:hAnsi="Arial" w:cs="Arial"/>
-        </w:rPr>
-        <w:t>precionara</w:t>
+          <w:b/>
+          <w:bCs/>
+        </w:rPr>
+        <w:t>canvas</w:t>
       </w:r>
       <w:proofErr w:type="spellEnd"/>
       <w:r>
         <w:rPr>
           <w:rFonts w:ascii="Arial" w:hAnsi="Arial" w:cs="Arial"/>
-        </w:rPr>
-        <w:t xml:space="preserve"> después esto se recibe </w:t>
+          <w:b/>
+          <w:bCs/>
+        </w:rPr>
+        <w:t xml:space="preserve"> </w:t>
+      </w:r>
+      <w:r>
+        <w:rPr>
+          <w:rFonts w:ascii="Arial" w:hAnsi="Arial" w:cs="Arial"/>
+        </w:rPr>
+        <w:t xml:space="preserve">en la </w:t>
+      </w:r>
+      <w:r>
+        <w:rPr>
+          <w:rFonts w:ascii="Arial" w:hAnsi="Arial" w:cs="Arial"/>
+        </w:rPr>
+        <w:t>dirección</w:t>
+      </w:r>
+      <w:r>
+        <w:rPr>
+          <w:rFonts w:ascii="Arial" w:hAnsi="Arial" w:cs="Arial"/>
+        </w:rPr>
+        <w:t xml:space="preserve"> del eje x. </w:t>
+      </w:r>
+      <w:r>
+        <w:rPr>
+          <w:rFonts w:ascii="Arial" w:hAnsi="Arial" w:cs="Arial"/>
+        </w:rPr>
+        <w:t xml:space="preserve">por lo que los obstáculos se quedan estáticos es el </w:t>
+      </w:r>
+      <w:r>
+        <w:rPr>
+          <w:rFonts w:ascii="Arial" w:hAnsi="Arial" w:cs="Arial"/>
+        </w:rPr>
+        <w:t>vehículo</w:t>
+      </w:r>
+      <w:r>
+        <w:rPr>
+          <w:rFonts w:ascii="Arial" w:hAnsi="Arial" w:cs="Arial"/>
+        </w:rPr>
+        <w:t xml:space="preserve"> el que se desplaza a </w:t>
+      </w:r>
+      <w:r>
+        <w:rPr>
+          <w:rFonts w:ascii="Arial" w:hAnsi="Arial" w:cs="Arial"/>
+        </w:rPr>
+        <w:t>través</w:t>
+      </w:r>
+      <w:r>
+        <w:rPr>
+          <w:rFonts w:ascii="Arial" w:hAnsi="Arial" w:cs="Arial"/>
+        </w:rPr>
+        <w:t xml:space="preserve"> de la pantalla, se me hizo mucho </w:t>
+      </w:r>
+      <w:r>
+        <w:rPr>
+          <w:rFonts w:ascii="Arial" w:hAnsi="Arial" w:cs="Arial"/>
+        </w:rPr>
+        <w:t>más</w:t>
+      </w:r>
+      <w:r>
+        <w:rPr>
+          <w:rFonts w:ascii="Arial" w:hAnsi="Arial" w:cs="Arial"/>
+        </w:rPr>
+        <w:t xml:space="preserve"> sencillo mover 1 solo objeto a mover varios. </w:t>
+      </w:r>
+    </w:p>
+    <w:p>
+      <w:pPr>
+        <w:rPr>
+          <w:rFonts w:ascii="Arial" w:hAnsi="Arial" w:cs="Arial"/>
+        </w:rPr>
+      </w:pPr>
+      <w:r>
+        <w:rPr>
+          <w:rFonts w:ascii="Arial" w:hAnsi="Arial" w:cs="Arial"/>
+        </w:rPr>
+        <w:t xml:space="preserve">Después de eso checamos si en ese movimiento la posición en la que esta </w:t>
+      </w:r>
+      <w:r>
+        <w:rPr>
+          <w:rFonts w:ascii="Arial" w:hAnsi="Arial" w:cs="Arial"/>
+        </w:rPr>
+        <w:t>ahora</w:t>
+      </w:r>
+      <w:r>
+        <w:rPr>
+          <w:rFonts w:ascii="Arial" w:hAnsi="Arial" w:cs="Arial"/>
+        </w:rPr>
+        <w:t xml:space="preserve"> el </w:t>
+      </w:r>
+      <w:r>
+        <w:rPr>
+          <w:rFonts w:ascii="Arial" w:hAnsi="Arial" w:cs="Arial"/>
+        </w:rPr>
+        <w:t>vehículo</w:t>
+      </w:r>
+      <w:r>
+        <w:rPr>
+          <w:rFonts w:ascii="Arial" w:hAnsi="Arial" w:cs="Arial"/>
+        </w:rPr>
+        <w:t xml:space="preserve"> ya se cualquiera de las 3 partes que lo conforman no han “</w:t>
+      </w:r>
+      <w:r>
+        <w:rPr>
+          <w:rFonts w:ascii="Arial" w:hAnsi="Arial" w:cs="Arial"/>
+          <w:b/>
+          <w:bCs/>
+        </w:rPr>
+        <w:t>chocado</w:t>
+      </w:r>
+      <w:r>
+        <w:rPr>
+          <w:rFonts w:ascii="Arial" w:hAnsi="Arial" w:cs="Arial"/>
+        </w:rPr>
+        <w:t xml:space="preserve">” con algún obstáculo, la </w:t>
+      </w:r>
+      <w:r>
+        <w:rPr>
+          <w:rFonts w:ascii="Arial" w:hAnsi="Arial" w:cs="Arial"/>
+        </w:rPr>
+        <w:t>presentación</w:t>
+      </w:r>
+      <w:r>
+        <w:rPr>
+          <w:rFonts w:ascii="Arial" w:hAnsi="Arial" w:cs="Arial"/>
+        </w:rPr>
+        <w:t xml:space="preserve"> en el </w:t>
+      </w:r>
+      <w:r>
+        <w:rPr>
+          <w:rFonts w:ascii="Arial" w:hAnsi="Arial" w:cs="Arial"/>
+        </w:rPr>
+        <w:t>vector</w:t>
+      </w:r>
+      <w:r>
+        <w:rPr>
+          <w:rFonts w:ascii="Arial" w:hAnsi="Arial" w:cs="Arial"/>
+        </w:rPr>
+        <w:t xml:space="preserve"> de </w:t>
       </w:r>
       <w:proofErr w:type="spellStart"/>
       <w:r>
         <w:rPr>
           <w:rFonts w:ascii="Arial" w:hAnsi="Arial" w:cs="Arial"/>
-        </w:rPr>
-        <w:t>del</w:t>
+          <w:b/>
+          <w:bCs/>
+        </w:rPr>
+        <w:t>obstacle</w:t>
       </w:r>
       <w:proofErr w:type="spellEnd"/>
       <w:r>
         <w:rPr>
           <w:rFonts w:ascii="Arial" w:hAnsi="Arial" w:cs="Arial"/>
-        </w:rPr>
-        <w:t xml:space="preserve"> la ISR a </w:t>
+          <w:b/>
+          <w:bCs/>
+        </w:rPr>
+        <w:t xml:space="preserve"> </w:t>
+      </w:r>
+      <w:r>
+        <w:rPr>
+          <w:rFonts w:ascii="Arial" w:hAnsi="Arial" w:cs="Arial"/>
+        </w:rPr>
+        <w:t xml:space="preserve">lo tengo representado como 1, en </w:t>
+      </w:r>
+      <w:r>
+        <w:rPr>
+          <w:rFonts w:ascii="Arial" w:hAnsi="Arial" w:cs="Arial"/>
+        </w:rPr>
+        <w:t>toda la matriz</w:t>
+      </w:r>
+      <w:r>
+        <w:rPr>
+          <w:rFonts w:ascii="Arial" w:hAnsi="Arial" w:cs="Arial"/>
+        </w:rPr>
+        <w:t xml:space="preserve"> en donde aparezca 1 indica que es un obstáculo. </w:t>
+      </w:r>
+      <w:r>
+        <w:rPr>
+          <w:rFonts w:ascii="Arial" w:hAnsi="Arial" w:cs="Arial"/>
+        </w:rPr>
+        <w:t xml:space="preserve">Si es </w:t>
+      </w:r>
+      <w:r>
+        <w:rPr>
+          <w:rFonts w:ascii="Arial" w:hAnsi="Arial" w:cs="Arial"/>
+        </w:rPr>
+        <w:t>así</w:t>
+      </w:r>
+      <w:r>
+        <w:rPr>
+          <w:rFonts w:ascii="Arial" w:hAnsi="Arial" w:cs="Arial"/>
+        </w:rPr>
+        <w:t xml:space="preserve"> termina el juego si no continua </w:t>
+      </w:r>
+    </w:p>
+    <w:p>
+      <w:pPr>
+        <w:rPr>
+          <w:rFonts w:ascii="Arial" w:hAnsi="Arial" w:cs="Arial"/>
+        </w:rPr>
+      </w:pPr>
+      <w:r>
+        <w:rPr>
+          <w:rFonts w:ascii="Arial" w:hAnsi="Arial" w:cs="Arial"/>
+        </w:rPr>
+        <w:t xml:space="preserve">Por lo que presenta en pantalla el juego actual, el cual se </w:t>
+      </w:r>
+      <w:r>
+        <w:rPr>
+          <w:rFonts w:ascii="Arial" w:hAnsi="Arial" w:cs="Arial"/>
+        </w:rPr>
+        <w:t>está</w:t>
+      </w:r>
+      <w:r>
+        <w:rPr>
+          <w:rFonts w:ascii="Arial" w:hAnsi="Arial" w:cs="Arial"/>
+        </w:rPr>
+        <w:t xml:space="preserve"> constantemente refrescando con un </w:t>
       </w:r>
       <w:proofErr w:type="spellStart"/>
       <w:r>
         <w:rPr>
           <w:rFonts w:ascii="Arial" w:hAnsi="Arial" w:cs="Arial"/>
         </w:rPr>
-        <w:t>travez</w:t>
+        <w:t>delay</w:t>
       </w:r>
       <w:proofErr w:type="spellEnd"/>
       <w:r>
         <w:rPr>
           <w:rFonts w:ascii="Arial" w:hAnsi="Arial" w:cs="Arial"/>
         </w:rPr>
-        <w:t xml:space="preserve"> de la cola. </w:t>
-      </w:r>
-      <w:r>
-        <w:rPr>
-          <w:rFonts w:ascii="Arial" w:hAnsi="Arial" w:cs="Arial"/>
-        </w:rPr>
-        <w:t xml:space="preserve">Esto hará ir al </w:t>
-      </w:r>
-      <w:proofErr w:type="spellStart"/>
-      <w:r>
-        <w:rPr>
-          <w:rFonts w:ascii="Arial" w:hAnsi="Arial" w:cs="Arial"/>
-        </w:rPr>
-        <w:t>vehiculo</w:t>
-      </w:r>
-      <w:proofErr w:type="spellEnd"/>
-      <w:r>
-        <w:rPr>
-          <w:rFonts w:ascii="Arial" w:hAnsi="Arial" w:cs="Arial"/>
-        </w:rPr>
-        <w:t xml:space="preserve"> hacia arriba o hacia abajo limitando el rango en que se puede desplazar el </w:t>
-      </w:r>
-      <w:proofErr w:type="spellStart"/>
-      <w:r>
-        <w:rPr>
-          <w:rFonts w:ascii="Arial" w:hAnsi="Arial" w:cs="Arial"/>
-        </w:rPr>
-        <w:t>vechiculo</w:t>
-      </w:r>
-      <w:proofErr w:type="spellEnd"/>
-      <w:r>
-        <w:rPr>
-          <w:rFonts w:ascii="Arial" w:hAnsi="Arial" w:cs="Arial"/>
-        </w:rPr>
-        <w:t xml:space="preserve">, porque si no se limita puede irse </w:t>
-      </w:r>
-      <w:proofErr w:type="spellStart"/>
-      <w:r>
-        <w:rPr>
-          <w:rFonts w:ascii="Arial" w:hAnsi="Arial" w:cs="Arial"/>
-        </w:rPr>
-        <w:t>mas</w:t>
-      </w:r>
-      <w:proofErr w:type="spellEnd"/>
-      <w:r>
-        <w:rPr>
-          <w:rFonts w:ascii="Arial" w:hAnsi="Arial" w:cs="Arial"/>
-        </w:rPr>
-        <w:t xml:space="preserve"> allá de la matriz o de la “pantalla” </w:t>
-      </w:r>
-      <w:proofErr w:type="spellStart"/>
-      <w:r>
-        <w:rPr>
-          <w:rFonts w:ascii="Arial" w:hAnsi="Arial" w:cs="Arial"/>
-        </w:rPr>
-        <w:t>premitida</w:t>
-      </w:r>
-      <w:proofErr w:type="spellEnd"/>
-      <w:r>
-        <w:rPr>
-          <w:rFonts w:ascii="Arial" w:hAnsi="Arial" w:cs="Arial"/>
-        </w:rPr>
-        <w:t xml:space="preserve"> y causara un bug. </w:t>
-      </w:r>
-      <w:r>
-        <w:rPr>
-          <w:rFonts w:ascii="Arial" w:hAnsi="Arial" w:cs="Arial"/>
-        </w:rPr>
-        <w:t xml:space="preserve">Por lo que indicamos condiciones por el caso que el jugador este presionando constantemente un botón ya sea el de subir o el de bajar. </w:t>
-      </w:r>
-    </w:p>
-    <w:p>
-      <w:pPr>
-        <w:rPr>
-          <w:rFonts w:ascii="Arial" w:hAnsi="Arial" w:cs="Arial"/>
-        </w:rPr>
-      </w:pPr>
-      <w:r>
-        <w:rPr>
-          <w:rFonts w:ascii="Arial" w:hAnsi="Arial" w:cs="Arial"/>
-        </w:rPr>
-        <w:t xml:space="preserve">Si no se </w:t>
-      </w:r>
-      <w:proofErr w:type="spellStart"/>
-      <w:r>
-        <w:rPr>
-          <w:rFonts w:ascii="Arial" w:hAnsi="Arial" w:cs="Arial"/>
-        </w:rPr>
-        <w:t>decidio</w:t>
-      </w:r>
-      <w:proofErr w:type="spellEnd"/>
-      <w:r>
-        <w:rPr>
-          <w:rFonts w:ascii="Arial" w:hAnsi="Arial" w:cs="Arial"/>
-        </w:rPr>
-        <w:t xml:space="preserve"> terminar con el juego lo que sigue el mover el </w:t>
-      </w:r>
-      <w:proofErr w:type="spellStart"/>
-      <w:r>
-        <w:rPr>
-          <w:rFonts w:ascii="Arial" w:hAnsi="Arial" w:cs="Arial"/>
-        </w:rPr>
-        <w:t>vehiculo</w:t>
-      </w:r>
-      <w:proofErr w:type="spellEnd"/>
-      <w:r>
-        <w:rPr>
-          <w:rFonts w:ascii="Arial" w:hAnsi="Arial" w:cs="Arial"/>
-        </w:rPr>
-        <w:t xml:space="preserve">, esto lo hacemos con la función </w:t>
-      </w:r>
-      <w:proofErr w:type="spellStart"/>
-      <w:r>
-        <w:rPr>
-          <w:rFonts w:ascii="Arial" w:hAnsi="Arial" w:cs="Arial"/>
-          <w:b/>
-          <w:bCs/>
-        </w:rPr>
-        <w:t>move_vehicle</w:t>
-      </w:r>
-      <w:proofErr w:type="spellEnd"/>
-      <w:r>
-        <w:rPr>
-          <w:rFonts w:ascii="Arial" w:hAnsi="Arial" w:cs="Arial"/>
-          <w:b/>
-          <w:bCs/>
-        </w:rPr>
-        <w:t xml:space="preserve">() </w:t>
-      </w:r>
-      <w:r>
-        <w:rPr>
-          <w:rFonts w:ascii="Arial" w:hAnsi="Arial" w:cs="Arial"/>
-        </w:rPr>
-        <w:t xml:space="preserve">que mueve el </w:t>
-      </w:r>
-      <w:proofErr w:type="spellStart"/>
-      <w:r>
-        <w:rPr>
-          <w:rFonts w:ascii="Arial" w:hAnsi="Arial" w:cs="Arial"/>
-        </w:rPr>
-        <w:t>vehiculo</w:t>
-      </w:r>
-      <w:proofErr w:type="spellEnd"/>
-      <w:r>
-        <w:rPr>
-          <w:rFonts w:ascii="Arial" w:hAnsi="Arial" w:cs="Arial"/>
-        </w:rPr>
-        <w:t xml:space="preserve"> dentro del </w:t>
-      </w:r>
-      <w:proofErr w:type="spellStart"/>
-      <w:r>
-        <w:rPr>
-          <w:rFonts w:ascii="Arial" w:hAnsi="Arial" w:cs="Arial"/>
-          <w:b/>
-          <w:bCs/>
-        </w:rPr>
-        <w:t>canvas</w:t>
-      </w:r>
-      <w:proofErr w:type="spellEnd"/>
-      <w:r>
-        <w:rPr>
-          <w:rFonts w:ascii="Arial" w:hAnsi="Arial" w:cs="Arial"/>
-          <w:b/>
-          <w:bCs/>
-        </w:rPr>
-        <w:t xml:space="preserve"> </w:t>
-      </w:r>
-      <w:r>
-        <w:rPr>
-          <w:rFonts w:ascii="Arial" w:hAnsi="Arial" w:cs="Arial"/>
-        </w:rPr>
-        <w:t xml:space="preserve">en la </w:t>
-      </w:r>
-      <w:proofErr w:type="spellStart"/>
-      <w:r>
-        <w:rPr>
-          <w:rFonts w:ascii="Arial" w:hAnsi="Arial" w:cs="Arial"/>
-        </w:rPr>
-        <w:t>direccion</w:t>
-      </w:r>
-      <w:proofErr w:type="spellEnd"/>
-      <w:r>
-        <w:rPr>
-          <w:rFonts w:ascii="Arial" w:hAnsi="Arial" w:cs="Arial"/>
-        </w:rPr>
-        <w:t xml:space="preserve"> del eje x. </w:t>
-      </w:r>
-      <w:r>
-        <w:rPr>
-          <w:rFonts w:ascii="Arial" w:hAnsi="Arial" w:cs="Arial"/>
-        </w:rPr>
-        <w:t xml:space="preserve">por lo que los obstáculos se quedan estáticos es el </w:t>
-      </w:r>
-      <w:proofErr w:type="spellStart"/>
-      <w:r>
-        <w:rPr>
-          <w:rFonts w:ascii="Arial" w:hAnsi="Arial" w:cs="Arial"/>
-        </w:rPr>
-        <w:t>vehiculo</w:t>
-      </w:r>
-      <w:proofErr w:type="spellEnd"/>
-      <w:r>
-        <w:rPr>
-          <w:rFonts w:ascii="Arial" w:hAnsi="Arial" w:cs="Arial"/>
-        </w:rPr>
-        <w:t xml:space="preserve"> el que se desplaza a </w:t>
-      </w:r>
-      <w:proofErr w:type="spellStart"/>
-      <w:r>
-        <w:rPr>
-          <w:rFonts w:ascii="Arial" w:hAnsi="Arial" w:cs="Arial"/>
-        </w:rPr>
-        <w:t>travez</w:t>
-      </w:r>
-      <w:proofErr w:type="spellEnd"/>
-      <w:r>
-        <w:rPr>
-          <w:rFonts w:ascii="Arial" w:hAnsi="Arial" w:cs="Arial"/>
-        </w:rPr>
-        <w:t xml:space="preserve"> de la pantalla, se me hizo mucho </w:t>
-      </w:r>
-      <w:proofErr w:type="spellStart"/>
-      <w:r>
-        <w:rPr>
-          <w:rFonts w:ascii="Arial" w:hAnsi="Arial" w:cs="Arial"/>
-        </w:rPr>
-        <w:t>mas</w:t>
-      </w:r>
-      <w:proofErr w:type="spellEnd"/>
-      <w:r>
-        <w:rPr>
-          <w:rFonts w:ascii="Arial" w:hAnsi="Arial" w:cs="Arial"/>
-        </w:rPr>
-        <w:t xml:space="preserve"> sencillo mover 1 solo objeto a mover varios. </w:t>
-      </w:r>
-    </w:p>
-    <w:p>
-      <w:pPr>
-        <w:rPr>
-          <w:rFonts w:ascii="Arial" w:hAnsi="Arial" w:cs="Arial"/>
-        </w:rPr>
-      </w:pPr>
-      <w:r>
-        <w:rPr>
-          <w:rFonts w:ascii="Arial" w:hAnsi="Arial" w:cs="Arial"/>
-        </w:rPr>
-        <w:t xml:space="preserve">Después de eso checamos si en ese movimiento la posición en la que esta </w:t>
-      </w:r>
-      <w:proofErr w:type="spellStart"/>
-      <w:r>
-        <w:rPr>
-          <w:rFonts w:ascii="Arial" w:hAnsi="Arial" w:cs="Arial"/>
-        </w:rPr>
-        <w:t>ahira</w:t>
-      </w:r>
-      <w:proofErr w:type="spellEnd"/>
-      <w:r>
-        <w:rPr>
-          <w:rFonts w:ascii="Arial" w:hAnsi="Arial" w:cs="Arial"/>
-        </w:rPr>
-        <w:t xml:space="preserve"> el </w:t>
-      </w:r>
-      <w:proofErr w:type="spellStart"/>
-      <w:r>
-        <w:rPr>
-          <w:rFonts w:ascii="Arial" w:hAnsi="Arial" w:cs="Arial"/>
-        </w:rPr>
-        <w:t>vehiculo</w:t>
-      </w:r>
-      <w:proofErr w:type="spellEnd"/>
-      <w:r>
-        <w:rPr>
-          <w:rFonts w:ascii="Arial" w:hAnsi="Arial" w:cs="Arial"/>
-        </w:rPr>
-        <w:t xml:space="preserve"> ya se cualquiera de las 3 partes que lo conforman no han “</w:t>
-      </w:r>
-      <w:r>
-        <w:rPr>
-          <w:rFonts w:ascii="Arial" w:hAnsi="Arial" w:cs="Arial"/>
-          <w:b/>
-          <w:bCs/>
-        </w:rPr>
-        <w:t>chocado</w:t>
-      </w:r>
-      <w:r>
-        <w:rPr>
-          <w:rFonts w:ascii="Arial" w:hAnsi="Arial" w:cs="Arial"/>
-        </w:rPr>
-        <w:t xml:space="preserve">” con algún obstáculo, la </w:t>
-      </w:r>
-      <w:proofErr w:type="spellStart"/>
-      <w:r>
-        <w:rPr>
-          <w:rFonts w:ascii="Arial" w:hAnsi="Arial" w:cs="Arial"/>
-        </w:rPr>
-        <w:t>repsentacion</w:t>
-      </w:r>
-      <w:proofErr w:type="spellEnd"/>
-      <w:r>
-        <w:rPr>
-          <w:rFonts w:ascii="Arial" w:hAnsi="Arial" w:cs="Arial"/>
-        </w:rPr>
-        <w:t xml:space="preserve"> en el </w:t>
-      </w:r>
-      <w:proofErr w:type="spellStart"/>
-      <w:r>
-        <w:rPr>
-          <w:rFonts w:ascii="Arial" w:hAnsi="Arial" w:cs="Arial"/>
-        </w:rPr>
-        <w:t>vectos</w:t>
-      </w:r>
-      <w:proofErr w:type="spellEnd"/>
-      <w:r>
-        <w:rPr>
-          <w:rFonts w:ascii="Arial" w:hAnsi="Arial" w:cs="Arial"/>
-        </w:rPr>
-        <w:t xml:space="preserve"> de </w:t>
-      </w:r>
-      <w:proofErr w:type="spellStart"/>
-      <w:r>
-        <w:rPr>
-          <w:rFonts w:ascii="Arial" w:hAnsi="Arial" w:cs="Arial"/>
-          <w:b/>
-          <w:bCs/>
-        </w:rPr>
-        <w:t>obstacle</w:t>
-      </w:r>
-      <w:proofErr w:type="spellEnd"/>
-      <w:r>
-        <w:rPr>
-          <w:rFonts w:ascii="Arial" w:hAnsi="Arial" w:cs="Arial"/>
-          <w:b/>
-          <w:bCs/>
-        </w:rPr>
-        <w:t xml:space="preserve"> </w:t>
-      </w:r>
-      <w:r>
-        <w:rPr>
-          <w:rFonts w:ascii="Arial" w:hAnsi="Arial" w:cs="Arial"/>
-        </w:rPr>
-        <w:t xml:space="preserve">lo tengo representado como 1, en todo la matriz en donde aparezca 1 indica que es un obstáculo. </w:t>
-      </w:r>
-      <w:r>
-        <w:rPr>
-          <w:rFonts w:ascii="Arial" w:hAnsi="Arial" w:cs="Arial"/>
-        </w:rPr>
-        <w:t xml:space="preserve">Si es </w:t>
-      </w:r>
-      <w:proofErr w:type="spellStart"/>
-      <w:r>
-        <w:rPr>
-          <w:rFonts w:ascii="Arial" w:hAnsi="Arial" w:cs="Arial"/>
-        </w:rPr>
-        <w:t>asi</w:t>
-      </w:r>
-      <w:proofErr w:type="spellEnd"/>
-      <w:r>
-        <w:rPr>
-          <w:rFonts w:ascii="Arial" w:hAnsi="Arial" w:cs="Arial"/>
-        </w:rPr>
-        <w:t xml:space="preserve"> termina el juego si no continua </w:t>
-      </w:r>
-    </w:p>
-    <w:p>
-      <w:pPr>
-        <w:rPr>
-          <w:rFonts w:ascii="Arial" w:hAnsi="Arial" w:cs="Arial"/>
-        </w:rPr>
-      </w:pPr>
-      <w:r>
-        <w:rPr>
-          <w:rFonts w:ascii="Arial" w:hAnsi="Arial" w:cs="Arial"/>
-        </w:rPr>
-        <w:t xml:space="preserve">Por lo que presenta en pantalla el juego actual, el cual se </w:t>
-      </w:r>
-      <w:proofErr w:type="spellStart"/>
-      <w:r>
-        <w:rPr>
-          <w:rFonts w:ascii="Arial" w:hAnsi="Arial" w:cs="Arial"/>
-        </w:rPr>
-        <w:t>esta</w:t>
-      </w:r>
-      <w:proofErr w:type="spellEnd"/>
-      <w:r>
-        <w:rPr>
-          <w:rFonts w:ascii="Arial" w:hAnsi="Arial" w:cs="Arial"/>
-        </w:rPr>
-        <w:t xml:space="preserve"> constantemente refrescando con un </w:t>
-      </w:r>
-      <w:proofErr w:type="spellStart"/>
-      <w:r>
-        <w:rPr>
-          <w:rFonts w:ascii="Arial" w:hAnsi="Arial" w:cs="Arial"/>
-        </w:rPr>
-        <w:t>delay</w:t>
-      </w:r>
-      <w:proofErr w:type="spellEnd"/>
-      <w:r>
-        <w:rPr>
-          <w:rFonts w:ascii="Arial" w:hAnsi="Arial" w:cs="Arial"/>
-        </w:rPr>
         <w:t xml:space="preserve"> que podemos ajustar si lo queremos </w:t>
       </w:r>
-      <w:proofErr w:type="spellStart"/>
-      <w:r>
-        <w:rPr>
-          <w:rFonts w:ascii="Arial" w:hAnsi="Arial" w:cs="Arial"/>
-        </w:rPr>
-        <w:t>mas</w:t>
-      </w:r>
-      <w:proofErr w:type="spellEnd"/>
+      <w:r>
+        <w:rPr>
+          <w:rFonts w:ascii="Arial" w:hAnsi="Arial" w:cs="Arial"/>
+        </w:rPr>
+        <w:t>más</w:t>
+      </w:r>
       <w:r>
         <w:rPr>
           <w:rFonts w:ascii="Arial" w:hAnsi="Arial" w:cs="Arial"/>
         </w:rPr>
         <w:t xml:space="preserve"> rápido o </w:t>
       </w:r>
-      <w:proofErr w:type="spellStart"/>
-      <w:r>
-        <w:rPr>
-          <w:rFonts w:ascii="Arial" w:hAnsi="Arial" w:cs="Arial"/>
-        </w:rPr>
-        <w:t>mas</w:t>
-      </w:r>
-      <w:proofErr w:type="spellEnd"/>
+      <w:r>
+        <w:rPr>
+          <w:rFonts w:ascii="Arial" w:hAnsi="Arial" w:cs="Arial"/>
+        </w:rPr>
+        <w:t>más</w:t>
+      </w:r>
       <w:r>
         <w:rPr>
           <w:rFonts w:ascii="Arial" w:hAnsi="Arial" w:cs="Arial"/>
@@ -3197,89 +3748,81 @@
         </w:rPr>
         <w:t xml:space="preserve">Esta </w:t>
       </w:r>
+      <w:r>
+        <w:rPr>
+          <w:rFonts w:ascii="Arial" w:hAnsi="Arial" w:cs="Arial"/>
+        </w:rPr>
+        <w:t>función</w:t>
+      </w:r>
+      <w:r>
+        <w:rPr>
+          <w:rFonts w:ascii="Arial" w:hAnsi="Arial" w:cs="Arial"/>
+        </w:rPr>
+        <w:t xml:space="preserve"> de lo que se encarga es de establecer en que posición estará cada obstáculo, de manea </w:t>
+      </w:r>
       <w:proofErr w:type="spellStart"/>
       <w:r>
         <w:rPr>
           <w:rFonts w:ascii="Arial" w:hAnsi="Arial" w:cs="Arial"/>
         </w:rPr>
-        <w:t>funcion</w:t>
+        <w:t>random</w:t>
       </w:r>
       <w:proofErr w:type="spellEnd"/>
       <w:r>
         <w:rPr>
           <w:rFonts w:ascii="Arial" w:hAnsi="Arial" w:cs="Arial"/>
         </w:rPr>
-        <w:t xml:space="preserve"> de lo que se encarga es de establecer en que posición estará cada obstáculo, de manea </w:t>
+        <w:t xml:space="preserve"> elegimos </w:t>
+      </w:r>
+      <w:r>
+        <w:rPr>
+          <w:rFonts w:ascii="Arial" w:hAnsi="Arial" w:cs="Arial"/>
+        </w:rPr>
+        <w:t>cualquiera</w:t>
+      </w:r>
+      <w:r>
+        <w:rPr>
+          <w:rFonts w:ascii="Arial" w:hAnsi="Arial" w:cs="Arial"/>
+        </w:rPr>
+        <w:t xml:space="preserve"> de los 3 carriles que tenemos, que antes necesitamos establecer una regla, esta regla </w:t>
+      </w:r>
+      <w:r>
+        <w:rPr>
+          <w:rFonts w:ascii="Arial" w:hAnsi="Arial" w:cs="Arial"/>
+        </w:rPr>
+        <w:t>está</w:t>
+      </w:r>
+      <w:r>
+        <w:rPr>
+          <w:rFonts w:ascii="Arial" w:hAnsi="Arial" w:cs="Arial"/>
+        </w:rPr>
+        <w:t xml:space="preserve"> definida en la </w:t>
+      </w:r>
+      <w:r>
+        <w:rPr>
+          <w:rFonts w:ascii="Arial" w:hAnsi="Arial" w:cs="Arial"/>
+        </w:rPr>
+        <w:t>función</w:t>
+      </w:r>
+      <w:r>
+        <w:rPr>
+          <w:rFonts w:ascii="Arial" w:hAnsi="Arial" w:cs="Arial"/>
+        </w:rPr>
+        <w:t xml:space="preserve"> </w:t>
       </w:r>
       <w:proofErr w:type="spellStart"/>
       <w:r>
         <w:rPr>
           <w:rFonts w:ascii="Arial" w:hAnsi="Arial" w:cs="Arial"/>
-        </w:rPr>
-        <w:t>random</w:t>
+          <w:b/>
+          <w:bCs/>
+        </w:rPr>
+        <w:t>check_space_available</w:t>
       </w:r>
       <w:proofErr w:type="spellEnd"/>
       <w:r>
         <w:rPr>
           <w:rFonts w:ascii="Arial" w:hAnsi="Arial" w:cs="Arial"/>
-        </w:rPr>
-        <w:t xml:space="preserve"> elegimos </w:t>
-      </w:r>
-      <w:proofErr w:type="spellStart"/>
-      <w:r>
-        <w:rPr>
-          <w:rFonts w:ascii="Arial" w:hAnsi="Arial" w:cs="Arial"/>
-        </w:rPr>
-        <w:t>cualuqueria</w:t>
-      </w:r>
-      <w:proofErr w:type="spellEnd"/>
-      <w:r>
-        <w:rPr>
-          <w:rFonts w:ascii="Arial" w:hAnsi="Arial" w:cs="Arial"/>
-        </w:rPr>
-        <w:t xml:space="preserve"> de los 3 carriles que tenemos, que antes necesitamos establecer una regla, esta regla </w:t>
-      </w:r>
-      <w:proofErr w:type="spellStart"/>
-      <w:r>
-        <w:rPr>
-          <w:rFonts w:ascii="Arial" w:hAnsi="Arial" w:cs="Arial"/>
-        </w:rPr>
-        <w:t>esta</w:t>
-      </w:r>
-      <w:proofErr w:type="spellEnd"/>
-      <w:r>
-        <w:rPr>
-          <w:rFonts w:ascii="Arial" w:hAnsi="Arial" w:cs="Arial"/>
-        </w:rPr>
-        <w:t xml:space="preserve"> definida en la </w:t>
-      </w:r>
-      <w:proofErr w:type="spellStart"/>
-      <w:r>
-        <w:rPr>
-          <w:rFonts w:ascii="Arial" w:hAnsi="Arial" w:cs="Arial"/>
-        </w:rPr>
-        <w:t>funcion</w:t>
-      </w:r>
-      <w:proofErr w:type="spellEnd"/>
-      <w:r>
-        <w:rPr>
-          <w:rFonts w:ascii="Arial" w:hAnsi="Arial" w:cs="Arial"/>
-        </w:rPr>
-        <w:t xml:space="preserve"> </w:t>
-      </w:r>
-      <w:proofErr w:type="spellStart"/>
-      <w:r>
-        <w:rPr>
-          <w:rFonts w:ascii="Arial" w:hAnsi="Arial" w:cs="Arial"/>
-          <w:b/>
-          <w:bCs/>
-        </w:rPr>
-        <w:t>check_space_available</w:t>
-      </w:r>
-      <w:proofErr w:type="spellEnd"/>
-      <w:r>
-        <w:rPr>
-          <w:rFonts w:ascii="Arial" w:hAnsi="Arial" w:cs="Arial"/>
           <w:b/>
           <w:bCs/>
         </w:rPr>
@@ -3297,28 +3840,24 @@
         </w:rPr>
         <w:t xml:space="preserve">, si se cumple la </w:t>
       </w:r>
-      <w:proofErr w:type="spellStart"/>
-      <w:r>
-        <w:rPr>
-          <w:rFonts w:ascii="Arial" w:hAnsi="Arial" w:cs="Arial"/>
-        </w:rPr>
-        <w:t>funcion</w:t>
-      </w:r>
-      <w:proofErr w:type="spellEnd"/>
+      <w:r>
+        <w:rPr>
+          <w:rFonts w:ascii="Arial" w:hAnsi="Arial" w:cs="Arial"/>
+        </w:rPr>
+        <w:t>función</w:t>
+      </w:r>
       <w:r>
         <w:rPr>
           <w:rFonts w:ascii="Arial" w:hAnsi="Arial" w:cs="Arial"/>
         </w:rPr>
         <w:t xml:space="preserve"> manda 1 indicando que es viable insertar el obstáculo en la dirección prevista, para esto se ira </w:t>
       </w:r>
-      <w:proofErr w:type="spellStart"/>
-      <w:r>
-        <w:rPr>
-          <w:rFonts w:ascii="Arial" w:hAnsi="Arial" w:cs="Arial"/>
-        </w:rPr>
-        <w:t>recorrinedo</w:t>
-      </w:r>
-      <w:proofErr w:type="spellEnd"/>
+      <w:r>
+        <w:rPr>
+          <w:rFonts w:ascii="Arial" w:hAnsi="Arial" w:cs="Arial"/>
+        </w:rPr>
+        <w:t>recorriendo</w:t>
+      </w:r>
       <w:r>
         <w:rPr>
           <w:rFonts w:ascii="Arial" w:hAnsi="Arial" w:cs="Arial"/>
@@ -3432,67 +3971,154 @@
         </w:rPr>
         <w:t xml:space="preserve">La </w:t>
       </w:r>
+      <w:r>
+        <w:rPr>
+          <w:rFonts w:ascii="Arial" w:hAnsi="Arial" w:cs="Arial"/>
+        </w:rPr>
+        <w:t>función</w:t>
+      </w:r>
+      <w:r>
+        <w:rPr>
+          <w:rFonts w:ascii="Arial" w:hAnsi="Arial" w:cs="Arial"/>
+        </w:rPr>
+        <w:t xml:space="preserve"> recibe la fila y la columna en donde se planea insertar el obstáculo, </w:t>
+      </w:r>
+      <w:r>
+        <w:rPr>
+          <w:rFonts w:ascii="Arial" w:hAnsi="Arial" w:cs="Arial"/>
+        </w:rPr>
+        <w:t xml:space="preserve">pero debe de haber un espacio por el cual el </w:t>
+      </w:r>
+      <w:r>
+        <w:rPr>
+          <w:rFonts w:ascii="Arial" w:hAnsi="Arial" w:cs="Arial"/>
+        </w:rPr>
+        <w:t>vehículo</w:t>
+      </w:r>
+      <w:r>
+        <w:rPr>
+          <w:rFonts w:ascii="Arial" w:hAnsi="Arial" w:cs="Arial"/>
+        </w:rPr>
+        <w:t xml:space="preserve"> pueda pasar, el </w:t>
+      </w:r>
+      <w:r>
+        <w:rPr>
+          <w:rFonts w:ascii="Arial" w:hAnsi="Arial" w:cs="Arial"/>
+        </w:rPr>
+        <w:t>espacio</w:t>
+      </w:r>
+      <w:r>
+        <w:rPr>
+          <w:rFonts w:ascii="Arial" w:hAnsi="Arial" w:cs="Arial"/>
+        </w:rPr>
+        <w:t xml:space="preserve"> </w:t>
+      </w:r>
+      <w:r>
+        <w:rPr>
+          <w:rFonts w:ascii="Arial" w:hAnsi="Arial" w:cs="Arial"/>
+        </w:rPr>
+        <w:t>está</w:t>
+      </w:r>
+      <w:r>
+        <w:rPr>
+          <w:rFonts w:ascii="Arial" w:hAnsi="Arial" w:cs="Arial"/>
+        </w:rPr>
+        <w:t xml:space="preserve"> definido por la macro </w:t>
+      </w:r>
+      <w:r>
+        <w:rPr>
+          <w:rFonts w:ascii="Arial" w:hAnsi="Arial" w:cs="Arial"/>
+          <w:b/>
+          <w:bCs/>
+        </w:rPr>
+        <w:t xml:space="preserve">SPACE_OBJ </w:t>
+      </w:r>
+      <w:r>
+        <w:rPr>
+          <w:rFonts w:ascii="Arial" w:hAnsi="Arial" w:cs="Arial"/>
+        </w:rPr>
+        <w:t xml:space="preserve">en mi caso es de 5 espacios, por lo que le estoy diciendo, en el caso que se quiera insertar en el carril superior revisa en la fila inferior si en los siguientes </w:t>
+      </w:r>
+      <w:r>
+        <w:rPr>
+          <w:rFonts w:ascii="Arial" w:hAnsi="Arial" w:cs="Arial"/>
+          <w:b/>
+          <w:bCs/>
+        </w:rPr>
+        <w:t xml:space="preserve">SPACE_OBJ </w:t>
+      </w:r>
+      <w:r>
+        <w:rPr>
+          <w:rFonts w:ascii="Arial" w:hAnsi="Arial" w:cs="Arial"/>
+        </w:rPr>
+        <w:t xml:space="preserve">no hay otro obstáculo, esto dentro de la matriz </w:t>
+      </w:r>
       <w:proofErr w:type="spellStart"/>
       <w:r>
         <w:rPr>
           <w:rFonts w:ascii="Arial" w:hAnsi="Arial" w:cs="Arial"/>
-        </w:rPr>
-        <w:t>funcion</w:t>
+          <w:b/>
+          <w:bCs/>
+        </w:rPr>
+        <w:t>obstacle</w:t>
       </w:r>
       <w:proofErr w:type="spellEnd"/>
       <w:r>
         <w:rPr>
           <w:rFonts w:ascii="Arial" w:hAnsi="Arial" w:cs="Arial"/>
-        </w:rPr>
-        <w:t xml:space="preserve"> recibe la fila y la columna en donde se planea insertar el obstáculo, </w:t>
-      </w:r>
-      <w:r>
-        <w:rPr>
-          <w:rFonts w:ascii="Arial" w:hAnsi="Arial" w:cs="Arial"/>
-        </w:rPr>
-        <w:t xml:space="preserve">pero debe de haber un espacio por el cual el </w:t>
-      </w:r>
-      <w:proofErr w:type="spellStart"/>
-      <w:r>
-        <w:rPr>
-          <w:rFonts w:ascii="Arial" w:hAnsi="Arial" w:cs="Arial"/>
-        </w:rPr>
-        <w:t>vehiculo</w:t>
-      </w:r>
-      <w:proofErr w:type="spellEnd"/>
-      <w:r>
-        <w:rPr>
-          <w:rFonts w:ascii="Arial" w:hAnsi="Arial" w:cs="Arial"/>
-        </w:rPr>
-        <w:t xml:space="preserve"> pueda pasar, el </w:t>
-      </w:r>
-      <w:proofErr w:type="spellStart"/>
-      <w:r>
-        <w:rPr>
-          <w:rFonts w:ascii="Arial" w:hAnsi="Arial" w:cs="Arial"/>
-        </w:rPr>
-        <w:t>espcio</w:t>
-      </w:r>
-      <w:proofErr w:type="spellEnd"/>
-      <w:r>
-        <w:rPr>
-          <w:rFonts w:ascii="Arial" w:hAnsi="Arial" w:cs="Arial"/>
+          <w:b/>
+          <w:bCs/>
         </w:rPr>
         <w:t xml:space="preserve"> </w:t>
       </w:r>
-      <w:proofErr w:type="spellStart"/>
-      <w:r>
-        <w:rPr>
-          <w:rFonts w:ascii="Arial" w:hAnsi="Arial" w:cs="Arial"/>
-        </w:rPr>
-        <w:t>esta</w:t>
-      </w:r>
-      <w:proofErr w:type="spellEnd"/>
-      <w:r>
-        <w:rPr>
-          <w:rFonts w:ascii="Arial" w:hAnsi="Arial" w:cs="Arial"/>
-        </w:rPr>
-        <w:t xml:space="preserve"> definido por la macro </w:t>
+      <w:r>
+        <w:rPr>
+          <w:rFonts w:ascii="Arial" w:hAnsi="Arial" w:cs="Arial"/>
+        </w:rPr>
+        <w:t xml:space="preserve">si es </w:t>
+      </w:r>
+      <w:r>
+        <w:rPr>
+          <w:rFonts w:ascii="Arial" w:hAnsi="Arial" w:cs="Arial"/>
+        </w:rPr>
+        <w:t>así</w:t>
+      </w:r>
+      <w:r>
+        <w:rPr>
+          <w:rFonts w:ascii="Arial" w:hAnsi="Arial" w:cs="Arial"/>
+        </w:rPr>
+        <w:t xml:space="preserve"> regresa 1 indicando que se puede insertar si no, regresa 0 indicando que no</w:t>
+      </w:r>
+      <w:r>
+        <w:rPr>
+          <w:rFonts w:ascii="Arial" w:hAnsi="Arial" w:cs="Arial"/>
+        </w:rPr>
+        <w:t>.</w:t>
+      </w:r>
+    </w:p>
+    <w:p>
+      <w:pPr>
+        <w:rPr>
+          <w:rFonts w:ascii="Arial" w:hAnsi="Arial" w:cs="Arial"/>
+        </w:rPr>
+      </w:pPr>
+      <w:r>
+        <w:rPr>
+          <w:rFonts w:ascii="Arial" w:hAnsi="Arial" w:cs="Arial"/>
+        </w:rPr>
+        <w:t xml:space="preserve">En el caso del carril de en medio es parecido solo que aquí tengo que </w:t>
+      </w:r>
+      <w:r>
+        <w:rPr>
+          <w:rFonts w:ascii="Arial" w:hAnsi="Arial" w:cs="Arial"/>
+        </w:rPr>
+        <w:t>checar</w:t>
+      </w:r>
+      <w:r>
+        <w:rPr>
+          <w:rFonts w:ascii="Arial" w:hAnsi="Arial" w:cs="Arial"/>
+        </w:rPr>
+        <w:t xml:space="preserve"> al menos 1 carril debe de cumplir con la condición, revisa arriba y abajo si en los siguientes </w:t>
       </w:r>
       <w:r>
         <w:rPr>
@@ -3506,105 +4132,6 @@
         <w:rPr>
           <w:rFonts w:ascii="Arial" w:hAnsi="Arial" w:cs="Arial"/>
         </w:rPr>
-        <w:t xml:space="preserve">en mi caso es de 5 espacios, por lo que le estoy diciendo, en el caso que se quiera insertar en el carril superior revisa en la fila inferior si en los siguientes </w:t>
-      </w:r>
-      <w:r>
-        <w:rPr>
-          <w:rFonts w:ascii="Arial" w:hAnsi="Arial" w:cs="Arial"/>
-          <w:b/>
-          <w:bCs/>
-        </w:rPr>
-        <w:t xml:space="preserve">SPACE_OBJ </w:t>
-      </w:r>
-      <w:r>
-        <w:rPr>
-          <w:rFonts w:ascii="Arial" w:hAnsi="Arial" w:cs="Arial"/>
-        </w:rPr>
-        <w:t xml:space="preserve">no hay otro obstáculo, esto dentro de la matriz </w:t>
-      </w:r>
-      <w:proofErr w:type="spellStart"/>
-      <w:r>
-        <w:rPr>
-          <w:rFonts w:ascii="Arial" w:hAnsi="Arial" w:cs="Arial"/>
-          <w:b/>
-          <w:bCs/>
-        </w:rPr>
-        <w:t>obstacle</w:t>
-      </w:r>
-      <w:proofErr w:type="spellEnd"/>
-      <w:r>
-        <w:rPr>
-          <w:rFonts w:ascii="Arial" w:hAnsi="Arial" w:cs="Arial"/>
-          <w:b/>
-          <w:bCs/>
-        </w:rPr>
-        <w:t xml:space="preserve"> </w:t>
-      </w:r>
-      <w:r>
-        <w:rPr>
-          <w:rFonts w:ascii="Arial" w:hAnsi="Arial" w:cs="Arial"/>
-        </w:rPr>
-        <w:t xml:space="preserve">si es </w:t>
-      </w:r>
-      <w:proofErr w:type="spellStart"/>
-      <w:r>
-        <w:rPr>
-          <w:rFonts w:ascii="Arial" w:hAnsi="Arial" w:cs="Arial"/>
-        </w:rPr>
-        <w:t>asi</w:t>
-      </w:r>
-      <w:proofErr w:type="spellEnd"/>
-      <w:r>
-        <w:rPr>
-          <w:rFonts w:ascii="Arial" w:hAnsi="Arial" w:cs="Arial"/>
-        </w:rPr>
-        <w:t xml:space="preserve"> regresa 1 indicando que se puede insertar si no, regresa 0 indicando que no</w:t>
-      </w:r>
-      <w:r>
-        <w:rPr>
-          <w:rFonts w:ascii="Arial" w:hAnsi="Arial" w:cs="Arial"/>
-        </w:rPr>
-        <w:t>.</w:t>
-      </w:r>
-    </w:p>
-    <w:p>
-      <w:pPr>
-        <w:rPr>
-          <w:rFonts w:ascii="Arial" w:hAnsi="Arial" w:cs="Arial"/>
-        </w:rPr>
-      </w:pPr>
-      <w:r>
-        <w:rPr>
-          <w:rFonts w:ascii="Arial" w:hAnsi="Arial" w:cs="Arial"/>
-        </w:rPr>
-        <w:t xml:space="preserve">En el caso del carril de en medio es parecido solo que aquí tengo que </w:t>
-      </w:r>
-      <w:proofErr w:type="spellStart"/>
-      <w:r>
-        <w:rPr>
-          <w:rFonts w:ascii="Arial" w:hAnsi="Arial" w:cs="Arial"/>
-        </w:rPr>
-        <w:t>chechar</w:t>
-      </w:r>
-      <w:proofErr w:type="spellEnd"/>
-      <w:r>
-        <w:rPr>
-          <w:rFonts w:ascii="Arial" w:hAnsi="Arial" w:cs="Arial"/>
-        </w:rPr>
-        <w:t xml:space="preserve"> al menos 1 carril debe de cumplir con la condición, revisa arriba y abajo si en los siguientes </w:t>
-      </w:r>
-      <w:r>
-        <w:rPr>
-          <w:rFonts w:ascii="Arial" w:hAnsi="Arial" w:cs="Arial"/>
-          <w:b/>
-          <w:bCs/>
-        </w:rPr>
-        <w:t xml:space="preserve">SPACE_OBJ </w:t>
-      </w:r>
-      <w:r>
-        <w:rPr>
-          <w:rFonts w:ascii="Arial" w:hAnsi="Arial" w:cs="Arial"/>
-        </w:rPr>
         <w:t xml:space="preserve">espacios no hay obstáculo. </w:t>
       </w:r>
     </w:p>
@@ -3620,14 +4147,12 @@
         </w:rPr>
         <w:t xml:space="preserve">En el caso del carril inferior es la </w:t>
       </w:r>
-      <w:proofErr w:type="spellStart"/>
-      <w:r>
-        <w:rPr>
-          <w:rFonts w:ascii="Arial" w:hAnsi="Arial" w:cs="Arial"/>
-        </w:rPr>
-        <w:t>mimsa</w:t>
-      </w:r>
-      <w:proofErr w:type="spellEnd"/>
+      <w:r>
+        <w:rPr>
+          <w:rFonts w:ascii="Arial" w:hAnsi="Arial" w:cs="Arial"/>
+        </w:rPr>
+        <w:t>misma</w:t>
+      </w:r>
       <w:r>
         <w:rPr>
           <w:rFonts w:ascii="Arial" w:hAnsi="Arial" w:cs="Arial"/>
@@ -3802,34 +4327,32 @@
           <w:bCs/>
         </w:rPr>
       </w:pPr>
+      <w:r>
+        <w:rPr>
+          <w:rFonts w:ascii="Arial" w:hAnsi="Arial" w:cs="Arial"/>
+        </w:rPr>
+        <w:lastRenderedPageBreak/>
+        <w:t>Función</w:t>
+      </w:r>
+      <w:r>
+        <w:rPr>
+          <w:rFonts w:ascii="Arial" w:hAnsi="Arial" w:cs="Arial"/>
+        </w:rPr>
+        <w:t xml:space="preserve"> </w:t>
+      </w:r>
       <w:proofErr w:type="spellStart"/>
       <w:r>
         <w:rPr>
           <w:rFonts w:ascii="Arial" w:hAnsi="Arial" w:cs="Arial"/>
-        </w:rPr>
-        <w:lastRenderedPageBreak/>
-        <w:t>Funcion</w:t>
+          <w:b/>
+          <w:bCs/>
+        </w:rPr>
+        <w:t>move_vehicle</w:t>
       </w:r>
       <w:proofErr w:type="spellEnd"/>
       <w:r>
         <w:rPr>
           <w:rFonts w:ascii="Arial" w:hAnsi="Arial" w:cs="Arial"/>
-        </w:rPr>
-        <w:t xml:space="preserve"> </w:t>
-      </w:r>
-      <w:proofErr w:type="spellStart"/>
-      <w:r>
-        <w:rPr>
-          <w:rFonts w:ascii="Arial" w:hAnsi="Arial" w:cs="Arial"/>
-          <w:b/>
-          <w:bCs/>
-        </w:rPr>
-        <w:t>move_vehicle</w:t>
-      </w:r>
-      <w:proofErr w:type="spellEnd"/>
-      <w:r>
-        <w:rPr>
-          <w:rFonts w:ascii="Arial" w:hAnsi="Arial" w:cs="Arial"/>
           <w:b/>
           <w:bCs/>
         </w:rPr>
@@ -3848,42 +4371,36 @@
         </w:rPr>
         <w:t xml:space="preserve">Esta </w:t>
       </w:r>
-      <w:proofErr w:type="spellStart"/>
-      <w:r>
-        <w:rPr>
-          <w:rFonts w:ascii="Arial" w:hAnsi="Arial" w:cs="Arial"/>
-        </w:rPr>
-        <w:t>funcion</w:t>
-      </w:r>
-      <w:proofErr w:type="spellEnd"/>
+      <w:r>
+        <w:rPr>
+          <w:rFonts w:ascii="Arial" w:hAnsi="Arial" w:cs="Arial"/>
+        </w:rPr>
+        <w:t>función</w:t>
+      </w:r>
       <w:r>
         <w:rPr>
           <w:rFonts w:ascii="Arial" w:hAnsi="Arial" w:cs="Arial"/>
         </w:rPr>
         <w:t xml:space="preserve"> lo único que hace es ir avanzado en la posición que esta el </w:t>
       </w:r>
-      <w:proofErr w:type="spellStart"/>
-      <w:r>
-        <w:rPr>
-          <w:rFonts w:ascii="Arial" w:hAnsi="Arial" w:cs="Arial"/>
-        </w:rPr>
-        <w:t>vehiculo</w:t>
-      </w:r>
-      <w:proofErr w:type="spellEnd"/>
+      <w:r>
+        <w:rPr>
+          <w:rFonts w:ascii="Arial" w:hAnsi="Arial" w:cs="Arial"/>
+        </w:rPr>
+        <w:t>vehículo</w:t>
+      </w:r>
       <w:r>
         <w:rPr>
           <w:rFonts w:ascii="Arial" w:hAnsi="Arial" w:cs="Arial"/>
         </w:rPr>
         <w:t xml:space="preserve"> para mostrarlo en pantalla en el caso se llegue al final genera una nueva matriz de </w:t>
       </w:r>
-      <w:proofErr w:type="spellStart"/>
-      <w:r>
-        <w:rPr>
-          <w:rFonts w:ascii="Arial" w:hAnsi="Arial" w:cs="Arial"/>
-        </w:rPr>
-        <w:t>obtaculos</w:t>
-      </w:r>
-      <w:proofErr w:type="spellEnd"/>
+      <w:r>
+        <w:rPr>
+          <w:rFonts w:ascii="Arial" w:hAnsi="Arial" w:cs="Arial"/>
+        </w:rPr>
+        <w:t>obstáculos</w:t>
+      </w:r>
       <w:r>
         <w:rPr>
           <w:rFonts w:ascii="Arial" w:hAnsi="Arial" w:cs="Arial"/>
@@ -3954,129 +4471,117 @@
           <w:bCs/>
         </w:rPr>
       </w:pPr>
+      <w:r>
+        <w:rPr>
+          <w:rFonts w:ascii="Arial" w:hAnsi="Arial" w:cs="Arial"/>
+        </w:rPr>
+        <w:t>Función</w:t>
+      </w:r>
+      <w:r>
+        <w:rPr>
+          <w:rFonts w:ascii="Arial" w:hAnsi="Arial" w:cs="Arial"/>
+        </w:rPr>
+        <w:t xml:space="preserve"> </w:t>
+      </w:r>
       <w:proofErr w:type="spellStart"/>
       <w:r>
         <w:rPr>
           <w:rFonts w:ascii="Arial" w:hAnsi="Arial" w:cs="Arial"/>
-        </w:rPr>
-        <w:t>Funcion</w:t>
+          <w:b/>
+          <w:bCs/>
+        </w:rPr>
+        <w:t>check_collision</w:t>
       </w:r>
       <w:proofErr w:type="spellEnd"/>
       <w:r>
         <w:rPr>
           <w:rFonts w:ascii="Arial" w:hAnsi="Arial" w:cs="Arial"/>
-        </w:rPr>
-        <w:t xml:space="preserve"> </w:t>
+          <w:b/>
+          <w:bCs/>
+        </w:rPr>
+        <w:t>()</w:t>
+      </w:r>
+    </w:p>
+    <w:p>
+      <w:pPr>
+        <w:rPr>
+          <w:rFonts w:ascii="Arial" w:hAnsi="Arial" w:cs="Arial"/>
+        </w:rPr>
+      </w:pPr>
+      <w:r>
+        <w:rPr>
+          <w:rFonts w:ascii="Arial" w:hAnsi="Arial" w:cs="Arial"/>
+        </w:rPr>
+        <w:t>Mapeamos</w:t>
+      </w:r>
+      <w:r>
+        <w:rPr>
+          <w:rFonts w:ascii="Arial" w:hAnsi="Arial" w:cs="Arial"/>
+        </w:rPr>
+        <w:t xml:space="preserve"> cada parte del </w:t>
+      </w:r>
+      <w:r>
+        <w:rPr>
+          <w:rFonts w:ascii="Arial" w:hAnsi="Arial" w:cs="Arial"/>
+        </w:rPr>
+        <w:t>vehículo</w:t>
+      </w:r>
+      <w:r>
+        <w:rPr>
+          <w:rFonts w:ascii="Arial" w:hAnsi="Arial" w:cs="Arial"/>
+        </w:rPr>
+        <w:t xml:space="preserve"> para saber si algunas de las 3 partes que lo conforman tocan algún obstáculo. </w:t>
+      </w:r>
+      <w:r>
+        <w:rPr>
+          <w:rFonts w:ascii="Arial" w:hAnsi="Arial" w:cs="Arial"/>
+        </w:rPr>
+        <w:t xml:space="preserve">Como la </w:t>
+      </w:r>
+      <w:r>
+        <w:rPr>
+          <w:rFonts w:ascii="Arial" w:hAnsi="Arial" w:cs="Arial"/>
+        </w:rPr>
+        <w:t>variable</w:t>
+      </w:r>
+      <w:r>
+        <w:rPr>
+          <w:rFonts w:ascii="Arial" w:hAnsi="Arial" w:cs="Arial"/>
+        </w:rPr>
+        <w:t xml:space="preserve"> global de </w:t>
       </w:r>
       <w:proofErr w:type="spellStart"/>
       <w:r>
         <w:rPr>
           <w:rFonts w:ascii="Arial" w:hAnsi="Arial" w:cs="Arial"/>
-          <w:b/>
-          <w:bCs/>
-        </w:rPr>
-        <w:t>check_collision</w:t>
+        </w:rPr>
+        <w:t>currente_line</w:t>
       </w:r>
       <w:proofErr w:type="spellEnd"/>
       <w:r>
         <w:rPr>
           <w:rFonts w:ascii="Arial" w:hAnsi="Arial" w:cs="Arial"/>
-          <w:b/>
-          <w:bCs/>
-        </w:rPr>
-        <w:t>()</w:t>
-      </w:r>
-    </w:p>
-    <w:p>
-      <w:pPr>
-        <w:rPr>
-          <w:rFonts w:ascii="Arial" w:hAnsi="Arial" w:cs="Arial"/>
-        </w:rPr>
-      </w:pPr>
-      <w:proofErr w:type="spellStart"/>
-      <w:r>
-        <w:rPr>
-          <w:rFonts w:ascii="Arial" w:hAnsi="Arial" w:cs="Arial"/>
-        </w:rPr>
-        <w:t>Mepamos</w:t>
-      </w:r>
-      <w:proofErr w:type="spellEnd"/>
-      <w:r>
-        <w:rPr>
-          <w:rFonts w:ascii="Arial" w:hAnsi="Arial" w:cs="Arial"/>
-        </w:rPr>
-        <w:t xml:space="preserve"> cada parte del </w:t>
-      </w:r>
-      <w:proofErr w:type="spellStart"/>
-      <w:r>
-        <w:rPr>
-          <w:rFonts w:ascii="Arial" w:hAnsi="Arial" w:cs="Arial"/>
-        </w:rPr>
-        <w:t>vehiculo</w:t>
-      </w:r>
-      <w:proofErr w:type="spellEnd"/>
-      <w:r>
-        <w:rPr>
-          <w:rFonts w:ascii="Arial" w:hAnsi="Arial" w:cs="Arial"/>
-        </w:rPr>
-        <w:t xml:space="preserve"> para saber si algunas de las 3 partes que lo conforman tocan algún obstáculo. </w:t>
-      </w:r>
-      <w:r>
-        <w:rPr>
-          <w:rFonts w:ascii="Arial" w:hAnsi="Arial" w:cs="Arial"/>
-        </w:rPr>
-        <w:t xml:space="preserve">Como la </w:t>
-      </w:r>
-      <w:proofErr w:type="spellStart"/>
-      <w:r>
-        <w:rPr>
-          <w:rFonts w:ascii="Arial" w:hAnsi="Arial" w:cs="Arial"/>
-        </w:rPr>
-        <w:t>varibale</w:t>
-      </w:r>
-      <w:proofErr w:type="spellEnd"/>
-      <w:r>
-        <w:rPr>
-          <w:rFonts w:ascii="Arial" w:hAnsi="Arial" w:cs="Arial"/>
-        </w:rPr>
-        <w:t xml:space="preserve"> global de </w:t>
-      </w:r>
-      <w:proofErr w:type="spellStart"/>
-      <w:r>
-        <w:rPr>
-          <w:rFonts w:ascii="Arial" w:hAnsi="Arial" w:cs="Arial"/>
-        </w:rPr>
-        <w:t>currente_line</w:t>
-      </w:r>
-      <w:proofErr w:type="spellEnd"/>
-      <w:r>
-        <w:rPr>
-          <w:rFonts w:ascii="Arial" w:hAnsi="Arial" w:cs="Arial"/>
         </w:rPr>
         <w:t xml:space="preserve"> indica en que carril se </w:t>
       </w:r>
-      <w:proofErr w:type="spellStart"/>
-      <w:r>
-        <w:rPr>
-          <w:rFonts w:ascii="Arial" w:hAnsi="Arial" w:cs="Arial"/>
-        </w:rPr>
-        <w:t>esta</w:t>
-      </w:r>
-      <w:proofErr w:type="spellEnd"/>
+      <w:r>
+        <w:rPr>
+          <w:rFonts w:ascii="Arial" w:hAnsi="Arial" w:cs="Arial"/>
+        </w:rPr>
+        <w:t>está</w:t>
+      </w:r>
       <w:r>
         <w:rPr>
           <w:rFonts w:ascii="Arial" w:hAnsi="Arial" w:cs="Arial"/>
         </w:rPr>
         <w:t xml:space="preserve"> dirigiendo, esta </w:t>
       </w:r>
-      <w:proofErr w:type="spellStart"/>
-      <w:r>
-        <w:rPr>
-          <w:rFonts w:ascii="Arial" w:hAnsi="Arial" w:cs="Arial"/>
-        </w:rPr>
-        <w:t>vairbale</w:t>
-      </w:r>
-      <w:proofErr w:type="spellEnd"/>
+      <w:r>
+        <w:rPr>
+          <w:rFonts w:ascii="Arial" w:hAnsi="Arial" w:cs="Arial"/>
+        </w:rPr>
+        <w:t>variable</w:t>
+      </w:r>
       <w:r>
         <w:rPr>
           <w:rFonts w:ascii="Arial" w:hAnsi="Arial" w:cs="Arial"/>
@@ -4089,42 +4594,36 @@
         </w:rPr>
         <w:t xml:space="preserve">por lo que le pasamos el carril actual y en donde se encuentra le </w:t>
       </w:r>
-      <w:proofErr w:type="spellStart"/>
-      <w:r>
-        <w:rPr>
-          <w:rFonts w:ascii="Arial" w:hAnsi="Arial" w:cs="Arial"/>
-        </w:rPr>
-        <w:t>vehiculo</w:t>
-      </w:r>
-      <w:proofErr w:type="spellEnd"/>
+      <w:r>
+        <w:rPr>
+          <w:rFonts w:ascii="Arial" w:hAnsi="Arial" w:cs="Arial"/>
+        </w:rPr>
+        <w:t>vehículo</w:t>
+      </w:r>
       <w:r>
         <w:rPr>
           <w:rFonts w:ascii="Arial" w:hAnsi="Arial" w:cs="Arial"/>
         </w:rPr>
         <w:t xml:space="preserve"> en el eje x, si alguna de las 3 piezas </w:t>
       </w:r>
-      <w:proofErr w:type="spellStart"/>
-      <w:r>
-        <w:rPr>
-          <w:rFonts w:ascii="Arial" w:hAnsi="Arial" w:cs="Arial"/>
-        </w:rPr>
-        <w:t>esta</w:t>
-      </w:r>
-      <w:proofErr w:type="spellEnd"/>
+      <w:r>
+        <w:rPr>
+          <w:rFonts w:ascii="Arial" w:hAnsi="Arial" w:cs="Arial"/>
+        </w:rPr>
+        <w:t>está</w:t>
+      </w:r>
       <w:r>
         <w:rPr>
           <w:rFonts w:ascii="Arial" w:hAnsi="Arial" w:cs="Arial"/>
         </w:rPr>
         <w:t xml:space="preserve"> en la misma </w:t>
       </w:r>
-      <w:proofErr w:type="spellStart"/>
-      <w:r>
-        <w:rPr>
-          <w:rFonts w:ascii="Arial" w:hAnsi="Arial" w:cs="Arial"/>
-        </w:rPr>
-        <w:t>poscion</w:t>
-      </w:r>
-      <w:proofErr w:type="spellEnd"/>
+      <w:r>
+        <w:rPr>
+          <w:rFonts w:ascii="Arial" w:hAnsi="Arial" w:cs="Arial"/>
+        </w:rPr>
+        <w:t>posición</w:t>
+      </w:r>
       <w:r>
         <w:rPr>
           <w:rFonts w:ascii="Arial" w:hAnsi="Arial" w:cs="Arial"/>
@@ -4274,7 +4773,19 @@
         <w:rPr>
           <w:rFonts w:ascii="Arial" w:hAnsi="Arial" w:cs="Arial"/>
         </w:rPr>
-        <w:t xml:space="preserve"> actualizamos lo que debería de mostrar la matiz </w:t>
+        <w:t xml:space="preserve"> actualizamos lo que debería de mostrar </w:t>
+      </w:r>
+      <w:r>
+        <w:rPr>
+          <w:rFonts w:ascii="Arial" w:hAnsi="Arial" w:cs="Arial"/>
+        </w:rPr>
+        <w:t>el matiz</w:t>
+      </w:r>
+      <w:r>
+        <w:rPr>
+          <w:rFonts w:ascii="Arial" w:hAnsi="Arial" w:cs="Arial"/>
+        </w:rPr>
+        <w:t xml:space="preserve"> </w:t>
       </w:r>
       <w:proofErr w:type="spellStart"/>
       <w:r>
@@ -4321,14 +4832,12 @@
           <w:rFonts w:ascii="Arial" w:hAnsi="Arial" w:cs="Arial"/>
         </w:rPr>
       </w:pPr>
-      <w:proofErr w:type="spellStart"/>
-      <w:r>
-        <w:rPr>
-          <w:rFonts w:ascii="Arial" w:hAnsi="Arial" w:cs="Arial"/>
-        </w:rPr>
-        <w:t>Depues</w:t>
-      </w:r>
-      <w:proofErr w:type="spellEnd"/>
+      <w:r>
+        <w:rPr>
+          <w:rFonts w:ascii="Arial" w:hAnsi="Arial" w:cs="Arial"/>
+        </w:rPr>
+        <w:t>De pues</w:t>
+      </w:r>
       <w:r>
         <w:rPr>
           <w:rFonts w:ascii="Arial" w:hAnsi="Arial" w:cs="Arial"/>
@@ -4376,14 +4885,12 @@
         </w:rPr>
         <w:t xml:space="preserve">Al igual que dibujamos al </w:t>
       </w:r>
-      <w:proofErr w:type="spellStart"/>
-      <w:r>
-        <w:rPr>
-          <w:rFonts w:ascii="Arial" w:hAnsi="Arial" w:cs="Arial"/>
-        </w:rPr>
-        <w:t>vehiculo</w:t>
-      </w:r>
-      <w:proofErr w:type="spellEnd"/>
+      <w:r>
+        <w:rPr>
+          <w:rFonts w:ascii="Arial" w:hAnsi="Arial" w:cs="Arial"/>
+        </w:rPr>
+        <w:t>vehículo</w:t>
+      </w:r>
       <w:r>
         <w:rPr>
           <w:rFonts w:ascii="Arial" w:hAnsi="Arial" w:cs="Arial"/>
@@ -4472,33 +4979,31 @@
           <w:bCs/>
         </w:rPr>
       </w:pPr>
+      <w:r>
+        <w:rPr>
+          <w:rFonts w:ascii="Arial" w:hAnsi="Arial" w:cs="Arial"/>
+        </w:rPr>
+        <w:t>Función</w:t>
+      </w:r>
+      <w:r>
+        <w:rPr>
+          <w:rFonts w:ascii="Arial" w:hAnsi="Arial" w:cs="Arial"/>
+        </w:rPr>
+        <w:t xml:space="preserve"> </w:t>
+      </w:r>
       <w:proofErr w:type="spellStart"/>
       <w:r>
         <w:rPr>
           <w:rFonts w:ascii="Arial" w:hAnsi="Arial" w:cs="Arial"/>
-        </w:rPr>
-        <w:t>Funcion</w:t>
+          <w:b/>
+          <w:bCs/>
+        </w:rPr>
+        <w:t>display_games</w:t>
       </w:r>
       <w:proofErr w:type="spellEnd"/>
       <w:r>
         <w:rPr>
           <w:rFonts w:ascii="Arial" w:hAnsi="Arial" w:cs="Arial"/>
-        </w:rPr>
-        <w:t xml:space="preserve"> </w:t>
-      </w:r>
-      <w:proofErr w:type="spellStart"/>
-      <w:r>
-        <w:rPr>
-          <w:rFonts w:ascii="Arial" w:hAnsi="Arial" w:cs="Arial"/>
-          <w:b/>
-          <w:bCs/>
-        </w:rPr>
-        <w:t>display_games</w:t>
-      </w:r>
-      <w:proofErr w:type="spellEnd"/>
-      <w:r>
-        <w:rPr>
-          <w:rFonts w:ascii="Arial" w:hAnsi="Arial" w:cs="Arial"/>
           <w:b/>
           <w:bCs/>
         </w:rPr>
@@ -4517,14 +5022,12 @@
         </w:rPr>
         <w:t xml:space="preserve">Esta es la </w:t>
       </w:r>
-      <w:proofErr w:type="spellStart"/>
-      <w:r>
-        <w:rPr>
-          <w:rFonts w:ascii="Arial" w:hAnsi="Arial" w:cs="Arial"/>
-        </w:rPr>
-        <w:t>funcion</w:t>
-      </w:r>
-      <w:proofErr w:type="spellEnd"/>
+      <w:r>
+        <w:rPr>
+          <w:rFonts w:ascii="Arial" w:hAnsi="Arial" w:cs="Arial"/>
+        </w:rPr>
+        <w:t>función</w:t>
+      </w:r>
       <w:r>
         <w:rPr>
           <w:rFonts w:ascii="Arial" w:hAnsi="Arial" w:cs="Arial"/>
@@ -4621,112 +5124,108 @@
         </w:rPr>
         <w:t xml:space="preserve">Con lo que tuve un poco de problemas fue el entender a los grupo de eventos, las colas ya había trabajo con ellas y ya </w:t>
       </w:r>
-      <w:proofErr w:type="spellStart"/>
-      <w:r>
-        <w:rPr>
-          <w:rFonts w:ascii="Arial" w:hAnsi="Arial" w:cs="Arial"/>
-        </w:rPr>
-        <w:t>tenia</w:t>
-      </w:r>
-      <w:proofErr w:type="spellEnd"/>
+      <w:r>
+        <w:rPr>
+          <w:rFonts w:ascii="Arial" w:hAnsi="Arial" w:cs="Arial"/>
+        </w:rPr>
+        <w:t>tenía</w:t>
+      </w:r>
       <w:r>
         <w:rPr>
           <w:rFonts w:ascii="Arial" w:hAnsi="Arial" w:cs="Arial"/>
         </w:rPr>
         <w:t xml:space="preserve"> una </w:t>
       </w:r>
-      <w:proofErr w:type="spellStart"/>
-      <w:r>
-        <w:rPr>
-          <w:rFonts w:ascii="Arial" w:hAnsi="Arial" w:cs="Arial"/>
-        </w:rPr>
-        <w:t>nocion</w:t>
-      </w:r>
-      <w:proofErr w:type="spellEnd"/>
+      <w:r>
+        <w:rPr>
+          <w:rFonts w:ascii="Arial" w:hAnsi="Arial" w:cs="Arial"/>
+        </w:rPr>
+        <w:t>noción</w:t>
+      </w:r>
       <w:r>
         <w:rPr>
           <w:rFonts w:ascii="Arial" w:hAnsi="Arial" w:cs="Arial"/>
         </w:rPr>
         <w:t xml:space="preserve">, pero en esta practica me quedaron mas claras, pero lo que no </w:t>
       </w:r>
-      <w:proofErr w:type="spellStart"/>
-      <w:r>
-        <w:rPr>
-          <w:rFonts w:ascii="Arial" w:hAnsi="Arial" w:cs="Arial"/>
-        </w:rPr>
-        <w:t>entendia</w:t>
-      </w:r>
-      <w:proofErr w:type="spellEnd"/>
+      <w:r>
+        <w:rPr>
+          <w:rFonts w:ascii="Arial" w:hAnsi="Arial" w:cs="Arial"/>
+        </w:rPr>
+        <w:t>entendía</w:t>
+      </w:r>
       <w:r>
         <w:rPr>
           <w:rFonts w:ascii="Arial" w:hAnsi="Arial" w:cs="Arial"/>
         </w:rPr>
         <w:t xml:space="preserve"> muy bien era al grupo de eventos, me consto un </w:t>
       </w:r>
-      <w:proofErr w:type="spellStart"/>
-      <w:r>
-        <w:rPr>
-          <w:rFonts w:ascii="Arial" w:hAnsi="Arial" w:cs="Arial"/>
-        </w:rPr>
-        <w:t>pco</w:t>
-      </w:r>
-      <w:proofErr w:type="spellEnd"/>
+      <w:r>
+        <w:rPr>
+          <w:rFonts w:ascii="Arial" w:hAnsi="Arial" w:cs="Arial"/>
+        </w:rPr>
+        <w:t>poco</w:t>
+      </w:r>
       <w:r>
         <w:rPr>
           <w:rFonts w:ascii="Arial" w:hAnsi="Arial" w:cs="Arial"/>
         </w:rPr>
         <w:t xml:space="preserve"> lograr entender lo que </w:t>
       </w:r>
-      <w:proofErr w:type="spellStart"/>
-      <w:r>
-        <w:rPr>
-          <w:rFonts w:ascii="Arial" w:hAnsi="Arial" w:cs="Arial"/>
-        </w:rPr>
-        <w:t>reprsentaba</w:t>
-      </w:r>
-      <w:proofErr w:type="spellEnd"/>
+      <w:r>
+        <w:rPr>
+          <w:rFonts w:ascii="Arial" w:hAnsi="Arial" w:cs="Arial"/>
+        </w:rPr>
+        <w:t>representaba</w:t>
+      </w:r>
       <w:r>
         <w:rPr>
           <w:rFonts w:ascii="Arial" w:hAnsi="Arial" w:cs="Arial"/>
         </w:rPr>
         <w:t xml:space="preserve"> cada parámetro, </w:t>
       </w:r>
-      <w:proofErr w:type="spellStart"/>
-      <w:r>
-        <w:rPr>
-          <w:rFonts w:ascii="Arial" w:hAnsi="Arial" w:cs="Arial"/>
-        </w:rPr>
-        <w:t>asi</w:t>
-      </w:r>
-      <w:proofErr w:type="spellEnd"/>
+      <w:r>
+        <w:rPr>
+          <w:rFonts w:ascii="Arial" w:hAnsi="Arial" w:cs="Arial"/>
+        </w:rPr>
+        <w:t>así</w:t>
+      </w:r>
       <w:r>
         <w:rPr>
           <w:rFonts w:ascii="Arial" w:hAnsi="Arial" w:cs="Arial"/>
         </w:rPr>
         <w:t xml:space="preserve"> como el manejar las </w:t>
       </w:r>
-      <w:proofErr w:type="spellStart"/>
-      <w:r>
-        <w:rPr>
-          <w:rFonts w:ascii="Arial" w:hAnsi="Arial" w:cs="Arial"/>
-        </w:rPr>
-        <w:t>matirces</w:t>
-      </w:r>
-      <w:proofErr w:type="spellEnd"/>
-      <w:r>
-        <w:rPr>
-          <w:rFonts w:ascii="Arial" w:hAnsi="Arial" w:cs="Arial"/>
-        </w:rPr>
-        <w:t xml:space="preserve">, tenia tiempo que no programaba matrices siempre fue algo en donde batalle un poco, pero con la practica pude entender varias cosas que antes no comprendía, creo que al final de todo solo es cuestión de practicar </w:t>
-      </w:r>
-      <w:proofErr w:type="spellStart"/>
-      <w:r>
-        <w:rPr>
-          <w:rFonts w:ascii="Arial" w:hAnsi="Arial" w:cs="Arial"/>
-        </w:rPr>
-        <w:t>mas</w:t>
-      </w:r>
-      <w:proofErr w:type="spellEnd"/>
+      <w:r>
+        <w:rPr>
+          <w:rFonts w:ascii="Arial" w:hAnsi="Arial" w:cs="Arial"/>
+        </w:rPr>
+        <w:t>matices</w:t>
+      </w:r>
+      <w:r>
+        <w:rPr>
+          <w:rFonts w:ascii="Arial" w:hAnsi="Arial" w:cs="Arial"/>
+        </w:rPr>
+        <w:t xml:space="preserve">, </w:t>
+      </w:r>
+      <w:r>
+        <w:rPr>
+          <w:rFonts w:ascii="Arial" w:hAnsi="Arial" w:cs="Arial"/>
+        </w:rPr>
+        <w:t>tenía</w:t>
+      </w:r>
+      <w:r>
+        <w:rPr>
+          <w:rFonts w:ascii="Arial" w:hAnsi="Arial" w:cs="Arial"/>
+        </w:rPr>
+        <w:t xml:space="preserve"> tiempo que no programaba matrices siempre fue algo en donde batalle un poco, pero con la practica pude entender varias cosas que antes no comprendía, creo que al final de todo solo es cuestión de practicar </w:t>
+      </w:r>
+      <w:r>
+        <w:rPr>
+          <w:rFonts w:ascii="Arial" w:hAnsi="Arial" w:cs="Arial"/>
+        </w:rPr>
+        <w:t>más</w:t>
+      </w:r>
       <w:r>
         <w:rPr>
           <w:rFonts w:ascii="Arial" w:hAnsi="Arial" w:cs="Arial"/>
@@ -5230,6 +5729,119 @@
     </w:lvl>
   </w:abstractNum>
   <w:abstractNum w:abstractNumId="3" w15:restartNumberingAfterBreak="0">
+    <w:nsid w:val="592E0574"/>
+    <w:multiLevelType w:val="multilevel"/>
+    <w:tmpl w:val="A6383400"/>
+    <w:lvl w:ilvl="0">
+      <w:start w:val="1"/>
+      <w:numFmt w:val="decimal"/>
+      <w:lvlText w:val="%1."/>
+      <w:lvlJc w:val="left"/>
+      <w:pPr>
+        <w:tabs>
+          <w:tab w:val="num" w:pos="720"/>
+        </w:tabs>
+        <w:ind w:left="720" w:hanging="360"/>
+      </w:pPr>
+    </w:lvl>
+    <w:lvl w:ilvl="1" w:tentative="1">
+      <w:start w:val="1"/>
+      <w:numFmt w:val="decimal"/>
+      <w:lvlText w:val="%2."/>
+      <w:lvlJc w:val="left"/>
+      <w:pPr>
+        <w:tabs>
+          <w:tab w:val="num" w:pos="1440"/>
+        </w:tabs>
+        <w:ind w:left="1440" w:hanging="360"/>
+      </w:pPr>
+    </w:lvl>
+    <w:lvl w:ilvl="2" w:tentative="1">
+      <w:start w:val="1"/>
+      <w:numFmt w:val="decimal"/>
+      <w:lvlText w:val="%3."/>
+      <w:lvlJc w:val="left"/>
+      <w:pPr>
+        <w:tabs>
+          <w:tab w:val="num" w:pos="2160"/>
+        </w:tabs>
+        <w:ind w:left="2160" w:hanging="360"/>
+      </w:pPr>
+    </w:lvl>
+    <w:lvl w:ilvl="3" w:tentative="1">
+      <w:start w:val="1"/>
+      <w:numFmt w:val="decimal"/>
+      <w:lvlText w:val="%4."/>
+      <w:lvlJc w:val="left"/>
+      <w:pPr>
+        <w:tabs>
+          <w:tab w:val="num" w:pos="2880"/>
+        </w:tabs>
+        <w:ind w:left="2880" w:hanging="360"/>
+      </w:pPr>
+    </w:lvl>
+    <w:lvl w:ilvl="4" w:tentative="1">
+      <w:start w:val="1"/>
+      <w:numFmt w:val="decimal"/>
+      <w:lvlText w:val="%5."/>
+      <w:lvlJc w:val="left"/>
+      <w:pPr>
+        <w:tabs>
+          <w:tab w:val="num" w:pos="3600"/>
+        </w:tabs>
+        <w:ind w:left="3600" w:hanging="360"/>
+      </w:pPr>
+    </w:lvl>
+    <w:lvl w:ilvl="5" w:tentative="1">
+      <w:start w:val="1"/>
+      <w:numFmt w:val="decimal"/>
+      <w:lvlText w:val="%6."/>
+      <w:lvlJc w:val="left"/>
+      <w:pPr>
+        <w:tabs>
+          <w:tab w:val="num" w:pos="4320"/>
+        </w:tabs>
+        <w:ind w:left="4320" w:hanging="360"/>
+      </w:pPr>
+    </w:lvl>
+    <w:lvl w:ilvl="6" w:tentative="1">
+      <w:start w:val="1"/>
+      <w:numFmt w:val="decimal"/>
+      <w:lvlText w:val="%7."/>
+      <w:lvlJc w:val="left"/>
+      <w:pPr>
+        <w:tabs>
+          <w:tab w:val="num" w:pos="5040"/>
+        </w:tabs>
+        <w:ind w:left="5040" w:hanging="360"/>
+      </w:pPr>
+    </w:lvl>
+    <w:lvl w:ilvl="7" w:tentative="1">
+      <w:start w:val="1"/>
+      <w:numFmt w:val="decimal"/>
+      <w:lvlText w:val="%8."/>
+      <w:lvlJc w:val="left"/>
+      <w:pPr>
+        <w:tabs>
+          <w:tab w:val="num" w:pos="5760"/>
+        </w:tabs>
+        <w:ind w:left="5760" w:hanging="360"/>
+      </w:pPr>
+    </w:lvl>
+    <w:lvl w:ilvl="8" w:tentative="1">
+      <w:start w:val="1"/>
+      <w:numFmt w:val="decimal"/>
+      <w:lvlText w:val="%9."/>
+      <w:lvlJc w:val="left"/>
+      <w:pPr>
+        <w:tabs>
+          <w:tab w:val="num" w:pos="6480"/>
+        </w:tabs>
+        <w:ind w:left="6480" w:hanging="360"/>
+      </w:pPr>
+    </w:lvl>
+  </w:abstractNum>
+  <w:abstractNum w:abstractNumId="4" w15:restartNumberingAfterBreak="0">
     <w:nsid w:val="5B16008E"/>
     <w:multiLevelType w:val="multilevel"/>
     <w:tmpl w:val="8A00B5E8"/>
@@ -5315,7 +5927,156 @@
       </w:pPr>
     </w:lvl>
   </w:abstractNum>
-  <w:abstractNum w:abstractNumId="4" w15:restartNumberingAfterBreak="0">
+  <w:abstractNum w:abstractNumId="5" w15:restartNumberingAfterBreak="0">
+    <w:nsid w:val="638F27AB"/>
+    <w:multiLevelType w:val="multilevel"/>
+    <w:tmpl w:val="180CD1A8"/>
+    <w:lvl w:ilvl="0">
+      <w:start w:val="1"/>
+      <w:numFmt w:val="bullet"/>
+      <w:lvlText w:val=""/>
+      <w:lvlJc w:val="left"/>
+      <w:pPr>
+        <w:tabs>
+          <w:tab w:val="num" w:pos="720"/>
+        </w:tabs>
+        <w:ind w:left="720" w:hanging="360"/>
+      </w:pPr>
+      <w:rPr>
+        <w:rFonts w:ascii="Symbol" w:hAnsi="Symbol" w:hint="default"/>
+        <w:sz w:val="20"/>
+      </w:rPr>
+    </w:lvl>
+    <w:lvl w:ilvl="1" w:tentative="1">
+      <w:start w:val="1"/>
+      <w:numFmt w:val="bullet"/>
+      <w:lvlText w:val="o"/>
+      <w:lvlJc w:val="left"/>
+      <w:pPr>
+        <w:tabs>
+          <w:tab w:val="num" w:pos="1440"/>
+        </w:tabs>
+        <w:ind w:left="1440" w:hanging="360"/>
+      </w:pPr>
+      <w:rPr>
+        <w:rFonts w:ascii="Courier New" w:hAnsi="Courier New" w:hint="default"/>
+        <w:sz w:val="20"/>
+      </w:rPr>
+    </w:lvl>
+    <w:lvl w:ilvl="2" w:tentative="1">
+      <w:start w:val="1"/>
+      <w:numFmt w:val="bullet"/>
+      <w:lvlText w:val=""/>
+      <w:lvlJc w:val="left"/>
+      <w:pPr>
+        <w:tabs>
+          <w:tab w:val="num" w:pos="2160"/>
+        </w:tabs>
+        <w:ind w:left="2160" w:hanging="360"/>
+      </w:pPr>
+      <w:rPr>
+        <w:rFonts w:ascii="Wingdings" w:hAnsi="Wingdings" w:hint="default"/>
+        <w:sz w:val="20"/>
+      </w:rPr>
+    </w:lvl>
+    <w:lvl w:ilvl="3" w:tentative="1">
+      <w:start w:val="1"/>
+      <w:numFmt w:val="bullet"/>
+      <w:lvlText w:val=""/>
+      <w:lvlJc w:val="left"/>
+      <w:pPr>
+        <w:tabs>
+          <w:tab w:val="num" w:pos="2880"/>
+        </w:tabs>
+        <w:ind w:left="2880" w:hanging="360"/>
+      </w:pPr>
+      <w:rPr>
+        <w:rFonts w:ascii="Wingdings" w:hAnsi="Wingdings" w:hint="default"/>
+        <w:sz w:val="20"/>
+      </w:rPr>
+    </w:lvl>
+    <w:lvl w:ilvl="4" w:tentative="1">
+      <w:start w:val="1"/>
+      <w:numFmt w:val="bullet"/>
+      <w:lvlText w:val=""/>
+      <w:lvlJc w:val="left"/>
+      <w:pPr>
+        <w:tabs>
+          <w:tab w:val="num" w:pos="3600"/>
+        </w:tabs>
+        <w:ind w:left="3600" w:hanging="360"/>
+      </w:pPr>
+      <w:rPr>
+        <w:rFonts w:ascii="Wingdings" w:hAnsi="Wingdings" w:hint="default"/>
+        <w:sz w:val="20"/>
+      </w:rPr>
+    </w:lvl>
+    <w:lvl w:ilvl="5" w:tentative="1">
+      <w:start w:val="1"/>
+      <w:numFmt w:val="bullet"/>
+      <w:lvlText w:val=""/>
+      <w:lvlJc w:val="left"/>
+      <w:pPr>
+        <w:tabs>
+          <w:tab w:val="num" w:pos="4320"/>
+        </w:tabs>
+        <w:ind w:left="4320" w:hanging="360"/>
+      </w:pPr>
+      <w:rPr>
+        <w:rFonts w:ascii="Wingdings" w:hAnsi="Wingdings" w:hint="default"/>
+        <w:sz w:val="20"/>
+      </w:rPr>
+    </w:lvl>
+    <w:lvl w:ilvl="6" w:tentative="1">
+      <w:start w:val="1"/>
+      <w:numFmt w:val="bullet"/>
+      <w:lvlText w:val=""/>
+      <w:lvlJc w:val="left"/>
+      <w:pPr>
+        <w:tabs>
+          <w:tab w:val="num" w:pos="5040"/>
+        </w:tabs>
+        <w:ind w:left="5040" w:hanging="360"/>
+      </w:pPr>
+      <w:rPr>
+        <w:rFonts w:ascii="Wingdings" w:hAnsi="Wingdings" w:hint="default"/>
+        <w:sz w:val="20"/>
+      </w:rPr>
+    </w:lvl>
+    <w:lvl w:ilvl="7" w:tentative="1">
+      <w:start w:val="1"/>
+      <w:numFmt w:val="bullet"/>
+      <w:lvlText w:val=""/>
+      <w:lvlJc w:val="left"/>
+      <w:pPr>
+        <w:tabs>
+          <w:tab w:val="num" w:pos="5760"/>
+        </w:tabs>
+        <w:ind w:left="5760" w:hanging="360"/>
+      </w:pPr>
+      <w:rPr>
+        <w:rFonts w:ascii="Wingdings" w:hAnsi="Wingdings" w:hint="default"/>
+        <w:sz w:val="20"/>
+      </w:rPr>
+    </w:lvl>
+    <w:lvl w:ilvl="8" w:tentative="1">
+      <w:start w:val="1"/>
+      <w:numFmt w:val="bullet"/>
+      <w:lvlText w:val=""/>
+      <w:lvlJc w:val="left"/>
+      <w:pPr>
+        <w:tabs>
+          <w:tab w:val="num" w:pos="6480"/>
+        </w:tabs>
+        <w:ind w:left="6480" w:hanging="360"/>
+      </w:pPr>
+      <w:rPr>
+        <w:rFonts w:ascii="Wingdings" w:hAnsi="Wingdings" w:hint="default"/>
+        <w:sz w:val="20"/>
+      </w:rPr>
+    </w:lvl>
+  </w:abstractNum>
+  <w:abstractNum w:abstractNumId="6" w15:restartNumberingAfterBreak="0">
     <w:nsid w:val="68A1692F"/>
     <w:multiLevelType w:val="hybridMultilevel"/>
     <w:tmpl w:val="12BE761E"/>
@@ -5401,11 +6162,160 @@
       </w:pPr>
     </w:lvl>
   </w:abstractNum>
+  <w:abstractNum w:abstractNumId="7" w15:restartNumberingAfterBreak="0">
+    <w:nsid w:val="70722452"/>
+    <w:multiLevelType w:val="multilevel"/>
+    <w:tmpl w:val="1D7EB31A"/>
+    <w:lvl w:ilvl="0">
+      <w:start w:val="1"/>
+      <w:numFmt w:val="bullet"/>
+      <w:lvlText w:val=""/>
+      <w:lvlJc w:val="left"/>
+      <w:pPr>
+        <w:tabs>
+          <w:tab w:val="num" w:pos="720"/>
+        </w:tabs>
+        <w:ind w:left="720" w:hanging="360"/>
+      </w:pPr>
+      <w:rPr>
+        <w:rFonts w:ascii="Symbol" w:hAnsi="Symbol" w:hint="default"/>
+        <w:sz w:val="20"/>
+      </w:rPr>
+    </w:lvl>
+    <w:lvl w:ilvl="1" w:tentative="1">
+      <w:start w:val="1"/>
+      <w:numFmt w:val="bullet"/>
+      <w:lvlText w:val="o"/>
+      <w:lvlJc w:val="left"/>
+      <w:pPr>
+        <w:tabs>
+          <w:tab w:val="num" w:pos="1440"/>
+        </w:tabs>
+        <w:ind w:left="1440" w:hanging="360"/>
+      </w:pPr>
+      <w:rPr>
+        <w:rFonts w:ascii="Courier New" w:hAnsi="Courier New" w:hint="default"/>
+        <w:sz w:val="20"/>
+      </w:rPr>
+    </w:lvl>
+    <w:lvl w:ilvl="2" w:tentative="1">
+      <w:start w:val="1"/>
+      <w:numFmt w:val="bullet"/>
+      <w:lvlText w:val=""/>
+      <w:lvlJc w:val="left"/>
+      <w:pPr>
+        <w:tabs>
+          <w:tab w:val="num" w:pos="2160"/>
+        </w:tabs>
+        <w:ind w:left="2160" w:hanging="360"/>
+      </w:pPr>
+      <w:rPr>
+        <w:rFonts w:ascii="Wingdings" w:hAnsi="Wingdings" w:hint="default"/>
+        <w:sz w:val="20"/>
+      </w:rPr>
+    </w:lvl>
+    <w:lvl w:ilvl="3" w:tentative="1">
+      <w:start w:val="1"/>
+      <w:numFmt w:val="bullet"/>
+      <w:lvlText w:val=""/>
+      <w:lvlJc w:val="left"/>
+      <w:pPr>
+        <w:tabs>
+          <w:tab w:val="num" w:pos="2880"/>
+        </w:tabs>
+        <w:ind w:left="2880" w:hanging="360"/>
+      </w:pPr>
+      <w:rPr>
+        <w:rFonts w:ascii="Wingdings" w:hAnsi="Wingdings" w:hint="default"/>
+        <w:sz w:val="20"/>
+      </w:rPr>
+    </w:lvl>
+    <w:lvl w:ilvl="4" w:tentative="1">
+      <w:start w:val="1"/>
+      <w:numFmt w:val="bullet"/>
+      <w:lvlText w:val=""/>
+      <w:lvlJc w:val="left"/>
+      <w:pPr>
+        <w:tabs>
+          <w:tab w:val="num" w:pos="3600"/>
+        </w:tabs>
+        <w:ind w:left="3600" w:hanging="360"/>
+      </w:pPr>
+      <w:rPr>
+        <w:rFonts w:ascii="Wingdings" w:hAnsi="Wingdings" w:hint="default"/>
+        <w:sz w:val="20"/>
+      </w:rPr>
+    </w:lvl>
+    <w:lvl w:ilvl="5" w:tentative="1">
+      <w:start w:val="1"/>
+      <w:numFmt w:val="bullet"/>
+      <w:lvlText w:val=""/>
+      <w:lvlJc w:val="left"/>
+      <w:pPr>
+        <w:tabs>
+          <w:tab w:val="num" w:pos="4320"/>
+        </w:tabs>
+        <w:ind w:left="4320" w:hanging="360"/>
+      </w:pPr>
+      <w:rPr>
+        <w:rFonts w:ascii="Wingdings" w:hAnsi="Wingdings" w:hint="default"/>
+        <w:sz w:val="20"/>
+      </w:rPr>
+    </w:lvl>
+    <w:lvl w:ilvl="6" w:tentative="1">
+      <w:start w:val="1"/>
+      <w:numFmt w:val="bullet"/>
+      <w:lvlText w:val=""/>
+      <w:lvlJc w:val="left"/>
+      <w:pPr>
+        <w:tabs>
+          <w:tab w:val="num" w:pos="5040"/>
+        </w:tabs>
+        <w:ind w:left="5040" w:hanging="360"/>
+      </w:pPr>
+      <w:rPr>
+        <w:rFonts w:ascii="Wingdings" w:hAnsi="Wingdings" w:hint="default"/>
+        <w:sz w:val="20"/>
+      </w:rPr>
+    </w:lvl>
+    <w:lvl w:ilvl="7" w:tentative="1">
+      <w:start w:val="1"/>
+      <w:numFmt w:val="bullet"/>
+      <w:lvlText w:val=""/>
+      <w:lvlJc w:val="left"/>
+      <w:pPr>
+        <w:tabs>
+          <w:tab w:val="num" w:pos="5760"/>
+        </w:tabs>
+        <w:ind w:left="5760" w:hanging="360"/>
+      </w:pPr>
+      <w:rPr>
+        <w:rFonts w:ascii="Wingdings" w:hAnsi="Wingdings" w:hint="default"/>
+        <w:sz w:val="20"/>
+      </w:rPr>
+    </w:lvl>
+    <w:lvl w:ilvl="8" w:tentative="1">
+      <w:start w:val="1"/>
+      <w:numFmt w:val="bullet"/>
+      <w:lvlText w:val=""/>
+      <w:lvlJc w:val="left"/>
+      <w:pPr>
+        <w:tabs>
+          <w:tab w:val="num" w:pos="6480"/>
+        </w:tabs>
+        <w:ind w:left="6480" w:hanging="360"/>
+      </w:pPr>
+      <w:rPr>
+        <w:rFonts w:ascii="Wingdings" w:hAnsi="Wingdings" w:hint="default"/>
+        <w:sz w:val="20"/>
+      </w:rPr>
+    </w:lvl>
+  </w:abstractNum>
   <w:num w:numId="1" w16cid:durableId="370571857">
-    <w:abstractNumId w:val="3"/>
+    <w:abstractNumId w:val="4"/>
   </w:num>
   <w:num w:numId="2" w16cid:durableId="1710689512">
-    <w:abstractNumId w:val="4"/>
+    <w:abstractNumId w:val="6"/>
   </w:num>
   <w:num w:numId="3" w16cid:durableId="1967806371">
     <w:abstractNumId w:val="2"/>
@@ -5415,6 +6325,15 @@
   </w:num>
   <w:num w:numId="5" w16cid:durableId="946961656">
     <w:abstractNumId w:val="0"/>
+  </w:num>
+  <w:num w:numId="6" w16cid:durableId="818156402">
+    <w:abstractNumId w:val="7"/>
+  </w:num>
+  <w:num w:numId="7" w16cid:durableId="1442139555">
+    <w:abstractNumId w:val="5"/>
+  </w:num>
+  <w:num w:numId="8" w16cid:durableId="949363797">
+    <w:abstractNumId w:val="3"/>
   </w:num>
 </w:numbering>
 </file>
@@ -5821,7 +6740,6 @@
   <w:style w:type="character" w:default="1" w:styleId="DefaultParagraphFont">
     <w:name w:val="Default Paragraph Font"/>
     <w:uiPriority w:val="1"/>
-    <w:semiHidden/>
     <w:unhideWhenUsed/>
   </w:style>
   <w:style w:type="table" w:default="1" w:styleId="TableNormal">

</xml_diff>